<commit_message>
up Inom added to TOKZ
</commit_message>
<xml_diff>
--- a/mode_docx_gen/pmi_tokz/template.docx
+++ b/mode_docx_gen/pmi_tokz/template.docx
@@ -3763,7 +3763,7 @@
           <v:shape id="_x0000_i1025" type="#_x0000_t75" style="width:411.85pt;height:283.4pt" o:ole="">
             <v:imagedata r:id="rId10" o:title=""/>
           </v:shape>
-          <o:OLEObject Type="Embed" ProgID="Acrobat.Document.DC" ShapeID="_x0000_i1025" DrawAspect="Content" ObjectID="_1804408008" r:id="rId11"/>
+          <o:OLEObject Type="Embed" ProgID="Acrobat.Document.DC" ShapeID="_x0000_i1025" DrawAspect="Content" ObjectID="_1804419107" r:id="rId11"/>
         </w:object>
       </w:r>
     </w:p>
@@ -6083,19 +6083,7 @@
               <w:rPr>
                 <w:color w:val="00B0F0"/>
               </w:rPr>
-              <w:t xml:space="preserve">МТЗ </w:t>
-            </w:r>
-            <w:r>
-              <w:rPr>
-                <w:color w:val="00B0F0"/>
-              </w:rPr>
-              <w:t>1</w:t>
-            </w:r>
-            <w:r>
-              <w:rPr>
-                <w:color w:val="00B0F0"/>
-              </w:rPr>
-              <w:t xml:space="preserve"> ст</w:t>
+              <w:t>МТЗ 1 ст</w:t>
             </w:r>
             <w:r>
               <w:rPr>
@@ -6771,46 +6759,33 @@
       <w:pPr>
         <w:pStyle w:val="a"/>
         <w:rPr>
-          <w:highlight w:val="yellow"/>
+          <w:highlight w:val="cyan"/>
         </w:rPr>
       </w:pPr>
       <w:r>
         <w:rPr>
-          <w:highlight w:val="yellow"/>
+          <w:highlight w:val="cyan"/>
         </w:rPr>
-        <w:lastRenderedPageBreak/>
         <w:t>Назначение дискретных входов</w:t>
       </w:r>
       <w:r>
         <w:rPr>
-          <w:highlight w:val="yellow"/>
+          <w:highlight w:val="cyan"/>
         </w:rPr>
         <w:t xml:space="preserve"> </w:t>
       </w:r>
       <w:r>
         <w:rPr>
-          <w:highlight w:val="yellow"/>
+          <w:highlight w:val="cyan"/>
         </w:rPr>
-        <w:t>ЮНИТ-М300 для проверки МТЗ 1</w:t>
-      </w:r>
-      <w:r>
-        <w:rPr>
-          <w:highlight w:val="yellow"/>
-        </w:rPr>
-        <w:t xml:space="preserve"> ступен</w:t>
+        <w:t xml:space="preserve">ЮНИТ-М300 для проверки </w:t>
       </w:r>
       <w:bookmarkEnd w:id="14"/>
       <w:r>
         <w:rPr>
-          <w:highlight w:val="yellow"/>
+          <w:highlight w:val="cyan"/>
         </w:rPr>
-        <w:t>и</w:t>
-      </w:r>
-      <w:r>
-        <w:rPr>
-          <w:highlight w:val="yellow"/>
-        </w:rPr>
-        <w:t xml:space="preserve"> и общих цепей</w:t>
+        <w:t>ТО РПН</w:t>
       </w:r>
     </w:p>
     <w:tbl>
@@ -6837,15 +6812,14 @@
               <w:rPr>
                 <w:b w:val="0"/>
                 <w:sz w:val="22"/>
-                <w:highlight w:val="yellow"/>
               </w:rPr>
             </w:pPr>
             <w:r>
               <w:rPr>
                 <w:b w:val="0"/>
                 <w:sz w:val="22"/>
-                <w:highlight w:val="yellow"/>
-              </w:rPr>
+              </w:rPr>
+              <w:lastRenderedPageBreak/>
               <w:t>Клемма на устройстве ЮНИТ-М300</w:t>
             </w:r>
           </w:p>
@@ -6859,14 +6833,12 @@
               <w:rPr>
                 <w:b w:val="0"/>
                 <w:sz w:val="22"/>
-                <w:highlight w:val="yellow"/>
               </w:rPr>
             </w:pPr>
             <w:r>
               <w:rPr>
                 <w:b w:val="0"/>
                 <w:sz w:val="22"/>
-                <w:highlight w:val="yellow"/>
               </w:rPr>
               <w:t xml:space="preserve">Номер ДВ </w:t>
             </w:r>
@@ -6881,14 +6853,12 @@
               <w:rPr>
                 <w:b w:val="0"/>
                 <w:sz w:val="22"/>
-                <w:highlight w:val="yellow"/>
               </w:rPr>
             </w:pPr>
             <w:r>
               <w:rPr>
                 <w:b w:val="0"/>
                 <w:sz w:val="22"/>
-                <w:highlight w:val="yellow"/>
               </w:rPr>
               <w:t>Наименование сигнала на ФСУ</w:t>
             </w:r>
@@ -6903,19 +6873,12 @@
           <w:p>
             <w:pPr>
               <w:pStyle w:val="af0"/>
-              <w:rPr>
-                <w:highlight w:val="yellow"/>
-              </w:rPr>
-            </w:pPr>
-            <w:r>
-              <w:rPr>
-                <w:highlight w:val="yellow"/>
-              </w:rPr>
+            </w:pPr>
+            <w:r>
               <w:t>М3.</w:t>
             </w:r>
             <w:r>
               <w:rPr>
-                <w:highlight w:val="yellow"/>
                 <w:lang w:val="en-US"/>
               </w:rPr>
               <w:t>XB:1</w:t>
@@ -6930,19 +6893,14 @@
             <w:pPr>
               <w:pStyle w:val="af0"/>
               <w:rPr>
-                <w:highlight w:val="yellow"/>
-                <w:lang w:val="en-US"/>
-              </w:rPr>
-            </w:pPr>
-            <w:r>
-              <w:rPr>
-                <w:highlight w:val="yellow"/>
-              </w:rPr>
+                <w:lang w:val="en-US"/>
+              </w:rPr>
+            </w:pPr>
+            <w:r>
               <w:t>М3.</w:t>
             </w:r>
             <w:r>
               <w:rPr>
-                <w:highlight w:val="yellow"/>
                 <w:lang w:val="en-US"/>
               </w:rPr>
               <w:t>1</w:t>
@@ -6957,15 +6915,9 @@
             <w:pPr>
               <w:pStyle w:val="af0"/>
               <w:jc w:val="left"/>
-              <w:rPr>
-                <w:highlight w:val="yellow"/>
-              </w:rPr>
-            </w:pPr>
-            <w:r>
-              <w:rPr>
-                <w:highlight w:val="yellow"/>
-              </w:rPr>
-              <w:t>МТЗ 1 ст на сигн</w:t>
+            </w:pPr>
+            <w:r>
+              <w:t>Вывод терминала</w:t>
             </w:r>
           </w:p>
         </w:tc>
@@ -6978,27 +6930,17 @@
           <w:p>
             <w:pPr>
               <w:pStyle w:val="af0"/>
-              <w:rPr>
-                <w:highlight w:val="yellow"/>
-              </w:rPr>
-            </w:pPr>
-            <w:r>
-              <w:rPr>
-                <w:highlight w:val="yellow"/>
-              </w:rPr>
+            </w:pPr>
+            <w:r>
               <w:t>М3.</w:t>
             </w:r>
             <w:r>
               <w:rPr>
-                <w:highlight w:val="yellow"/>
                 <w:lang w:val="en-US"/>
               </w:rPr>
               <w:t>XB:</w:t>
             </w:r>
             <w:r>
-              <w:rPr>
-                <w:highlight w:val="yellow"/>
-              </w:rPr>
               <w:t>2</w:t>
             </w:r>
           </w:p>
@@ -7011,19 +6953,14 @@
             <w:pPr>
               <w:pStyle w:val="af0"/>
               <w:rPr>
-                <w:highlight w:val="yellow"/>
-                <w:lang w:val="en-US"/>
-              </w:rPr>
-            </w:pPr>
-            <w:r>
-              <w:rPr>
-                <w:highlight w:val="yellow"/>
-              </w:rPr>
+                <w:lang w:val="en-US"/>
+              </w:rPr>
+            </w:pPr>
+            <w:r>
               <w:t>М3.</w:t>
             </w:r>
             <w:r>
               <w:rPr>
-                <w:highlight w:val="yellow"/>
                 <w:lang w:val="en-US"/>
               </w:rPr>
               <w:t>2</w:t>
@@ -7038,15 +6975,12 @@
             <w:pPr>
               <w:pStyle w:val="af0"/>
               <w:jc w:val="left"/>
-              <w:rPr>
-                <w:highlight w:val="yellow"/>
-              </w:rPr>
-            </w:pPr>
-            <w:r>
-              <w:rPr>
-                <w:highlight w:val="yellow"/>
-              </w:rPr>
-              <w:t>СВ НН1 включен</w:t>
+            </w:pPr>
+            <w:r>
+              <w:t xml:space="preserve">ОВ </w:t>
+            </w:r>
+            <w:r>
+              <w:t>ТО РПН</w:t>
             </w:r>
           </w:p>
         </w:tc>
@@ -7059,27 +6993,17 @@
           <w:p>
             <w:pPr>
               <w:pStyle w:val="af0"/>
-              <w:rPr>
-                <w:highlight w:val="yellow"/>
-              </w:rPr>
-            </w:pPr>
-            <w:r>
-              <w:rPr>
-                <w:highlight w:val="yellow"/>
-              </w:rPr>
+            </w:pPr>
+            <w:r>
               <w:t>М3.</w:t>
             </w:r>
             <w:r>
               <w:rPr>
-                <w:highlight w:val="yellow"/>
                 <w:lang w:val="en-US"/>
               </w:rPr>
               <w:t>XB:</w:t>
             </w:r>
             <w:r>
-              <w:rPr>
-                <w:highlight w:val="yellow"/>
-              </w:rPr>
               <w:t>3</w:t>
             </w:r>
           </w:p>
@@ -7092,19 +7016,14 @@
             <w:pPr>
               <w:pStyle w:val="af0"/>
               <w:rPr>
-                <w:highlight w:val="yellow"/>
-                <w:lang w:val="en-US"/>
-              </w:rPr>
-            </w:pPr>
-            <w:r>
-              <w:rPr>
-                <w:highlight w:val="yellow"/>
-              </w:rPr>
+                <w:lang w:val="en-US"/>
+              </w:rPr>
+            </w:pPr>
+            <w:r>
               <w:t>М3.</w:t>
             </w:r>
             <w:r>
               <w:rPr>
-                <w:highlight w:val="yellow"/>
                 <w:lang w:val="en-US"/>
               </w:rPr>
               <w:t>3</w:t>
@@ -7119,15 +7038,9 @@
             <w:pPr>
               <w:pStyle w:val="af0"/>
               <w:jc w:val="left"/>
-              <w:rPr>
-                <w:highlight w:val="yellow"/>
-              </w:rPr>
-            </w:pPr>
-            <w:r>
-              <w:rPr>
-                <w:highlight w:val="yellow"/>
-              </w:rPr>
-              <w:t>СВ НН2 включен</w:t>
+            </w:pPr>
+            <w:r>
+              <w:t>Резерв</w:t>
             </w:r>
           </w:p>
         </w:tc>
@@ -7140,27 +7053,17 @@
           <w:p>
             <w:pPr>
               <w:pStyle w:val="af0"/>
-              <w:rPr>
-                <w:highlight w:val="yellow"/>
-              </w:rPr>
-            </w:pPr>
-            <w:r>
-              <w:rPr>
-                <w:highlight w:val="yellow"/>
-              </w:rPr>
+            </w:pPr>
+            <w:r>
               <w:t>М3</w:t>
             </w:r>
             <w:r>
               <w:rPr>
-                <w:highlight w:val="yellow"/>
                 <w:lang w:val="en-US"/>
               </w:rPr>
               <w:t>.XB:</w:t>
             </w:r>
             <w:r>
-              <w:rPr>
-                <w:highlight w:val="yellow"/>
-              </w:rPr>
               <w:t>4</w:t>
             </w:r>
           </w:p>
@@ -7173,19 +7076,14 @@
             <w:pPr>
               <w:pStyle w:val="af0"/>
               <w:rPr>
-                <w:highlight w:val="yellow"/>
-                <w:lang w:val="en-US"/>
-              </w:rPr>
-            </w:pPr>
-            <w:r>
-              <w:rPr>
-                <w:highlight w:val="yellow"/>
-              </w:rPr>
+                <w:lang w:val="en-US"/>
+              </w:rPr>
+            </w:pPr>
+            <w:r>
               <w:t>М3</w:t>
             </w:r>
             <w:r>
               <w:rPr>
-                <w:highlight w:val="yellow"/>
                 <w:lang w:val="en-US"/>
               </w:rPr>
               <w:t>.4</w:t>
@@ -7200,15 +7098,9 @@
             <w:pPr>
               <w:pStyle w:val="af0"/>
               <w:jc w:val="left"/>
-              <w:rPr>
-                <w:highlight w:val="yellow"/>
-              </w:rPr>
-            </w:pPr>
-            <w:r>
-              <w:rPr>
-                <w:highlight w:val="yellow"/>
-              </w:rPr>
-              <w:t>В НН1 включен</w:t>
+            </w:pPr>
+            <w:r>
+              <w:t>Резерв</w:t>
             </w:r>
           </w:p>
         </w:tc>
@@ -7221,27 +7113,17 @@
           <w:p>
             <w:pPr>
               <w:pStyle w:val="af0"/>
-              <w:rPr>
-                <w:highlight w:val="yellow"/>
-              </w:rPr>
-            </w:pPr>
-            <w:r>
-              <w:rPr>
-                <w:highlight w:val="yellow"/>
-              </w:rPr>
+            </w:pPr>
+            <w:r>
               <w:t>М3</w:t>
             </w:r>
             <w:r>
               <w:rPr>
-                <w:highlight w:val="yellow"/>
                 <w:lang w:val="en-US"/>
               </w:rPr>
               <w:t>.XB:</w:t>
             </w:r>
             <w:r>
-              <w:rPr>
-                <w:highlight w:val="yellow"/>
-              </w:rPr>
               <w:t>5</w:t>
             </w:r>
           </w:p>
@@ -7254,19 +7136,14 @@
             <w:pPr>
               <w:pStyle w:val="af0"/>
               <w:rPr>
-                <w:highlight w:val="yellow"/>
-                <w:lang w:val="en-US"/>
-              </w:rPr>
-            </w:pPr>
-            <w:r>
-              <w:rPr>
-                <w:highlight w:val="yellow"/>
-              </w:rPr>
+                <w:lang w:val="en-US"/>
+              </w:rPr>
+            </w:pPr>
+            <w:r>
               <w:t>М3</w:t>
             </w:r>
             <w:r>
               <w:rPr>
-                <w:highlight w:val="yellow"/>
                 <w:lang w:val="en-US"/>
               </w:rPr>
               <w:t>.5</w:t>
@@ -7281,15 +7158,9 @@
             <w:pPr>
               <w:pStyle w:val="af0"/>
               <w:jc w:val="left"/>
-              <w:rPr>
-                <w:highlight w:val="yellow"/>
-              </w:rPr>
-            </w:pPr>
-            <w:r>
-              <w:rPr>
-                <w:highlight w:val="yellow"/>
-              </w:rPr>
-              <w:t>В НН2 включен</w:t>
+            </w:pPr>
+            <w:r>
+              <w:t>Резерв</w:t>
             </w:r>
           </w:p>
         </w:tc>
@@ -7303,19 +7174,14 @@
             <w:pPr>
               <w:pStyle w:val="af0"/>
               <w:rPr>
-                <w:highlight w:val="yellow"/>
-                <w:lang w:val="en-US"/>
-              </w:rPr>
-            </w:pPr>
-            <w:r>
-              <w:rPr>
-                <w:highlight w:val="yellow"/>
-              </w:rPr>
+                <w:lang w:val="en-US"/>
+              </w:rPr>
+            </w:pPr>
+            <w:r>
               <w:t>М</w:t>
             </w:r>
             <w:r>
               <w:rPr>
-                <w:highlight w:val="yellow"/>
                 <w:lang w:val="en-US"/>
               </w:rPr>
               <w:t>3.XB:6</w:t>
@@ -7330,19 +7196,14 @@
             <w:pPr>
               <w:pStyle w:val="af0"/>
               <w:rPr>
-                <w:highlight w:val="yellow"/>
-                <w:lang w:val="en-US"/>
-              </w:rPr>
-            </w:pPr>
-            <w:r>
-              <w:rPr>
-                <w:highlight w:val="yellow"/>
-              </w:rPr>
+                <w:lang w:val="en-US"/>
+              </w:rPr>
+            </w:pPr>
+            <w:r>
               <w:t>М</w:t>
             </w:r>
             <w:r>
               <w:rPr>
-                <w:highlight w:val="yellow"/>
                 <w:lang w:val="en-US"/>
               </w:rPr>
               <w:t>3.6</w:t>
@@ -7357,15 +7218,9 @@
             <w:pPr>
               <w:pStyle w:val="af0"/>
               <w:jc w:val="left"/>
-              <w:rPr>
-                <w:highlight w:val="yellow"/>
-              </w:rPr>
-            </w:pPr>
-            <w:r>
-              <w:rPr>
-                <w:highlight w:val="yellow"/>
-              </w:rPr>
-              <w:t>Срабатывание внешнего БНН1</w:t>
+            </w:pPr>
+            <w:r>
+              <w:t>Резерв</w:t>
             </w:r>
           </w:p>
         </w:tc>
@@ -7379,19 +7234,14 @@
             <w:pPr>
               <w:pStyle w:val="af0"/>
               <w:rPr>
-                <w:highlight w:val="yellow"/>
-                <w:lang w:val="en-US"/>
-              </w:rPr>
-            </w:pPr>
-            <w:r>
-              <w:rPr>
-                <w:highlight w:val="yellow"/>
-              </w:rPr>
+                <w:lang w:val="en-US"/>
+              </w:rPr>
+            </w:pPr>
+            <w:r>
               <w:t>М</w:t>
             </w:r>
             <w:r>
               <w:rPr>
-                <w:highlight w:val="yellow"/>
                 <w:lang w:val="en-US"/>
               </w:rPr>
               <w:t>3.XB:7</w:t>
@@ -7406,19 +7256,14 @@
             <w:pPr>
               <w:pStyle w:val="af0"/>
               <w:rPr>
-                <w:highlight w:val="yellow"/>
-                <w:lang w:val="en-US"/>
-              </w:rPr>
-            </w:pPr>
-            <w:r>
-              <w:rPr>
-                <w:highlight w:val="yellow"/>
-              </w:rPr>
+                <w:lang w:val="en-US"/>
+              </w:rPr>
+            </w:pPr>
+            <w:r>
               <w:t>М</w:t>
             </w:r>
             <w:r>
               <w:rPr>
-                <w:highlight w:val="yellow"/>
                 <w:lang w:val="en-US"/>
               </w:rPr>
               <w:t>3.7</w:t>
@@ -7433,16 +7278,9 @@
             <w:pPr>
               <w:pStyle w:val="af0"/>
               <w:jc w:val="left"/>
-              <w:rPr>
-                <w:highlight w:val="yellow"/>
-                <w:lang w:val="en-US"/>
-              </w:rPr>
-            </w:pPr>
-            <w:r>
-              <w:rPr>
-                <w:highlight w:val="yellow"/>
-              </w:rPr>
-              <w:t>Срабатывание внешнего БНН2</w:t>
+            </w:pPr>
+            <w:r>
+              <w:t>Резерв</w:t>
             </w:r>
           </w:p>
         </w:tc>
@@ -7456,19 +7294,14 @@
             <w:pPr>
               <w:pStyle w:val="af0"/>
               <w:rPr>
-                <w:highlight w:val="yellow"/>
-                <w:lang w:val="en-US"/>
-              </w:rPr>
-            </w:pPr>
-            <w:r>
-              <w:rPr>
-                <w:highlight w:val="yellow"/>
-              </w:rPr>
+                <w:lang w:val="en-US"/>
+              </w:rPr>
+            </w:pPr>
+            <w:r>
               <w:t>М</w:t>
             </w:r>
             <w:r>
               <w:rPr>
-                <w:highlight w:val="yellow"/>
                 <w:lang w:val="en-US"/>
               </w:rPr>
               <w:t>3.XB:9</w:t>
@@ -7483,19 +7316,14 @@
             <w:pPr>
               <w:pStyle w:val="af0"/>
               <w:rPr>
-                <w:highlight w:val="yellow"/>
-                <w:lang w:val="en-US"/>
-              </w:rPr>
-            </w:pPr>
-            <w:r>
-              <w:rPr>
-                <w:highlight w:val="yellow"/>
-              </w:rPr>
+                <w:lang w:val="en-US"/>
+              </w:rPr>
+            </w:pPr>
+            <w:r>
               <w:t>М</w:t>
             </w:r>
             <w:r>
               <w:rPr>
-                <w:highlight w:val="yellow"/>
                 <w:lang w:val="en-US"/>
               </w:rPr>
               <w:t>3.8</w:t>
@@ -7510,14 +7338,8 @@
             <w:pPr>
               <w:pStyle w:val="af0"/>
               <w:jc w:val="left"/>
-              <w:rPr>
-                <w:highlight w:val="yellow"/>
-              </w:rPr>
-            </w:pPr>
-            <w:r>
-              <w:rPr>
-                <w:highlight w:val="yellow"/>
-              </w:rPr>
+            </w:pPr>
+            <w:r>
               <w:t>Резерв</w:t>
             </w:r>
           </w:p>
@@ -7532,19 +7354,14 @@
             <w:pPr>
               <w:pStyle w:val="af0"/>
               <w:rPr>
-                <w:highlight w:val="yellow"/>
-                <w:lang w:val="en-US"/>
-              </w:rPr>
-            </w:pPr>
-            <w:r>
-              <w:rPr>
-                <w:highlight w:val="yellow"/>
-              </w:rPr>
+                <w:lang w:val="en-US"/>
+              </w:rPr>
+            </w:pPr>
+            <w:r>
               <w:t>М</w:t>
             </w:r>
             <w:r>
               <w:rPr>
-                <w:highlight w:val="yellow"/>
                 <w:lang w:val="en-US"/>
               </w:rPr>
               <w:t>3.XB:10</w:t>
@@ -7559,19 +7376,14 @@
             <w:pPr>
               <w:pStyle w:val="af0"/>
               <w:rPr>
-                <w:highlight w:val="yellow"/>
-                <w:lang w:val="en-US"/>
-              </w:rPr>
-            </w:pPr>
-            <w:r>
-              <w:rPr>
-                <w:highlight w:val="yellow"/>
-              </w:rPr>
+                <w:lang w:val="en-US"/>
+              </w:rPr>
+            </w:pPr>
+            <w:r>
               <w:t>М</w:t>
             </w:r>
             <w:r>
               <w:rPr>
-                <w:highlight w:val="yellow"/>
                 <w:lang w:val="en-US"/>
               </w:rPr>
               <w:t>3.9</w:t>
@@ -7586,14 +7398,8 @@
             <w:pPr>
               <w:pStyle w:val="af0"/>
               <w:jc w:val="left"/>
-              <w:rPr>
-                <w:highlight w:val="yellow"/>
-              </w:rPr>
-            </w:pPr>
-            <w:r>
-              <w:rPr>
-                <w:highlight w:val="yellow"/>
-              </w:rPr>
+            </w:pPr>
+            <w:r>
               <w:t>Резерв</w:t>
             </w:r>
           </w:p>
@@ -7607,27 +7413,17 @@
           <w:p>
             <w:pPr>
               <w:pStyle w:val="af0"/>
-              <w:rPr>
-                <w:highlight w:val="yellow"/>
-              </w:rPr>
-            </w:pPr>
-            <w:r>
-              <w:rPr>
-                <w:highlight w:val="yellow"/>
-              </w:rPr>
+            </w:pPr>
+            <w:r>
               <w:t>М</w:t>
             </w:r>
             <w:r>
               <w:rPr>
-                <w:highlight w:val="yellow"/>
                 <w:lang w:val="en-US"/>
               </w:rPr>
               <w:t>3.XB:</w:t>
             </w:r>
             <w:r>
-              <w:rPr>
-                <w:highlight w:val="yellow"/>
-              </w:rPr>
               <w:t>11</w:t>
             </w:r>
           </w:p>
@@ -7639,14 +7435,8 @@
           <w:p>
             <w:pPr>
               <w:pStyle w:val="af0"/>
-              <w:rPr>
-                <w:highlight w:val="yellow"/>
-              </w:rPr>
-            </w:pPr>
-            <w:r>
-              <w:rPr>
-                <w:highlight w:val="yellow"/>
-              </w:rPr>
+            </w:pPr>
+            <w:r>
               <w:t>М3.10</w:t>
             </w:r>
           </w:p>
@@ -7659,14 +7449,8 @@
             <w:pPr>
               <w:pStyle w:val="af0"/>
               <w:jc w:val="left"/>
-              <w:rPr>
-                <w:highlight w:val="yellow"/>
-              </w:rPr>
-            </w:pPr>
-            <w:r>
-              <w:rPr>
-                <w:highlight w:val="yellow"/>
-              </w:rPr>
+            </w:pPr>
+            <w:r>
               <w:t>Резерв</w:t>
             </w:r>
           </w:p>
@@ -7680,27 +7464,17 @@
           <w:p>
             <w:pPr>
               <w:pStyle w:val="af0"/>
-              <w:rPr>
-                <w:highlight w:val="yellow"/>
-              </w:rPr>
-            </w:pPr>
-            <w:r>
-              <w:rPr>
-                <w:highlight w:val="yellow"/>
-              </w:rPr>
+            </w:pPr>
+            <w:r>
               <w:t>М3.</w:t>
             </w:r>
             <w:r>
               <w:rPr>
-                <w:highlight w:val="yellow"/>
                 <w:lang w:val="en-US"/>
               </w:rPr>
               <w:t>XB:</w:t>
             </w:r>
             <w:r>
-              <w:rPr>
-                <w:highlight w:val="yellow"/>
-              </w:rPr>
               <w:t>12</w:t>
             </w:r>
           </w:p>
@@ -7712,14 +7486,8 @@
           <w:p>
             <w:pPr>
               <w:pStyle w:val="af0"/>
-              <w:rPr>
-                <w:highlight w:val="yellow"/>
-              </w:rPr>
-            </w:pPr>
-            <w:r>
-              <w:rPr>
-                <w:highlight w:val="yellow"/>
-              </w:rPr>
+            </w:pPr>
+            <w:r>
               <w:t>М3.11</w:t>
             </w:r>
           </w:p>
@@ -7732,14 +7500,8 @@
             <w:pPr>
               <w:pStyle w:val="af0"/>
               <w:jc w:val="left"/>
-              <w:rPr>
-                <w:highlight w:val="yellow"/>
-              </w:rPr>
-            </w:pPr>
-            <w:r>
-              <w:rPr>
-                <w:highlight w:val="yellow"/>
-              </w:rPr>
+            </w:pPr>
+            <w:r>
               <w:t>Резерв</w:t>
             </w:r>
           </w:p>
@@ -7753,27 +7515,17 @@
           <w:p>
             <w:pPr>
               <w:pStyle w:val="af0"/>
-              <w:rPr>
-                <w:highlight w:val="yellow"/>
-              </w:rPr>
-            </w:pPr>
-            <w:r>
-              <w:rPr>
-                <w:highlight w:val="yellow"/>
-              </w:rPr>
+            </w:pPr>
+            <w:r>
               <w:t>М3.</w:t>
             </w:r>
             <w:r>
               <w:rPr>
-                <w:highlight w:val="yellow"/>
                 <w:lang w:val="en-US"/>
               </w:rPr>
               <w:t>XB:</w:t>
             </w:r>
             <w:r>
-              <w:rPr>
-                <w:highlight w:val="yellow"/>
-              </w:rPr>
               <w:t>13</w:t>
             </w:r>
           </w:p>
@@ -7785,14 +7537,8 @@
           <w:p>
             <w:pPr>
               <w:pStyle w:val="af0"/>
-              <w:rPr>
-                <w:highlight w:val="yellow"/>
-              </w:rPr>
-            </w:pPr>
-            <w:r>
-              <w:rPr>
-                <w:highlight w:val="yellow"/>
-              </w:rPr>
+            </w:pPr>
+            <w:r>
               <w:t>М3.12</w:t>
             </w:r>
           </w:p>
@@ -7805,14 +7551,8 @@
             <w:pPr>
               <w:pStyle w:val="af0"/>
               <w:jc w:val="left"/>
-              <w:rPr>
-                <w:highlight w:val="yellow"/>
-              </w:rPr>
-            </w:pPr>
-            <w:r>
-              <w:rPr>
-                <w:highlight w:val="yellow"/>
-              </w:rPr>
+            </w:pPr>
+            <w:r>
               <w:t>Резерв</w:t>
             </w:r>
           </w:p>
@@ -7826,27 +7566,17 @@
           <w:p>
             <w:pPr>
               <w:pStyle w:val="af0"/>
-              <w:rPr>
-                <w:highlight w:val="yellow"/>
-              </w:rPr>
-            </w:pPr>
-            <w:r>
-              <w:rPr>
-                <w:highlight w:val="yellow"/>
-              </w:rPr>
+            </w:pPr>
+            <w:r>
               <w:t>М3.</w:t>
             </w:r>
             <w:r>
               <w:rPr>
-                <w:highlight w:val="yellow"/>
                 <w:lang w:val="en-US"/>
               </w:rPr>
               <w:t>XB</w:t>
             </w:r>
             <w:r>
-              <w:rPr>
-                <w:highlight w:val="yellow"/>
-              </w:rPr>
               <w:t>:14</w:t>
             </w:r>
           </w:p>
@@ -7858,14 +7588,8 @@
           <w:p>
             <w:pPr>
               <w:pStyle w:val="af0"/>
-              <w:rPr>
-                <w:highlight w:val="yellow"/>
-              </w:rPr>
-            </w:pPr>
-            <w:r>
-              <w:rPr>
-                <w:highlight w:val="yellow"/>
-              </w:rPr>
+            </w:pPr>
+            <w:r>
               <w:t>М3.13</w:t>
             </w:r>
           </w:p>
@@ -7878,14 +7602,8 @@
             <w:pPr>
               <w:pStyle w:val="af0"/>
               <w:jc w:val="left"/>
-              <w:rPr>
-                <w:highlight w:val="yellow"/>
-              </w:rPr>
-            </w:pPr>
-            <w:r>
-              <w:rPr>
-                <w:highlight w:val="yellow"/>
-              </w:rPr>
+            </w:pPr>
+            <w:r>
               <w:t>Резерв</w:t>
             </w:r>
           </w:p>
@@ -7899,27 +7617,17 @@
           <w:p>
             <w:pPr>
               <w:pStyle w:val="af0"/>
-              <w:rPr>
-                <w:highlight w:val="yellow"/>
-              </w:rPr>
-            </w:pPr>
-            <w:r>
-              <w:rPr>
-                <w:highlight w:val="yellow"/>
-              </w:rPr>
+            </w:pPr>
+            <w:r>
               <w:t>М3.</w:t>
             </w:r>
             <w:r>
               <w:rPr>
-                <w:highlight w:val="yellow"/>
                 <w:lang w:val="en-US"/>
               </w:rPr>
               <w:t>XB</w:t>
             </w:r>
             <w:r>
-              <w:rPr>
-                <w:highlight w:val="yellow"/>
-              </w:rPr>
               <w:t>:15</w:t>
             </w:r>
           </w:p>
@@ -7931,14 +7639,8 @@
           <w:p>
             <w:pPr>
               <w:pStyle w:val="af0"/>
-              <w:rPr>
-                <w:highlight w:val="yellow"/>
-              </w:rPr>
-            </w:pPr>
-            <w:r>
-              <w:rPr>
-                <w:highlight w:val="yellow"/>
-              </w:rPr>
+            </w:pPr>
+            <w:r>
               <w:t>М3.14</w:t>
             </w:r>
           </w:p>
@@ -7951,14 +7653,8 @@
             <w:pPr>
               <w:pStyle w:val="af0"/>
               <w:jc w:val="left"/>
-              <w:rPr>
-                <w:highlight w:val="yellow"/>
-              </w:rPr>
-            </w:pPr>
-            <w:r>
-              <w:rPr>
-                <w:highlight w:val="yellow"/>
-              </w:rPr>
+            </w:pPr>
+            <w:r>
               <w:t>Резерв</w:t>
             </w:r>
           </w:p>
@@ -10253,7 +9949,6 @@
               <w:rPr>
                 <w:highlight w:val="yellow"/>
               </w:rPr>
-              <w:lastRenderedPageBreak/>
               <w:t>М3.</w:t>
             </w:r>
             <w:r>
@@ -10315,6 +10010,7 @@
       </w:pPr>
       <w:bookmarkStart w:id="16" w:name="_Toc193266522"/>
       <w:r>
+        <w:lastRenderedPageBreak/>
         <w:t>Назначение выходных реле устройства ЮНИТ-М-300</w:t>
       </w:r>
       <w:bookmarkEnd w:id="16"/>
@@ -10557,7 +10253,20 @@
               <w:rPr>
                 <w:color w:val="00B0F0"/>
               </w:rPr>
-              <w:t>УВ / УВ: Ввод</w:t>
+              <w:t>ТО</w:t>
+            </w:r>
+            <w:r>
+              <w:rPr>
+                <w:color w:val="00B0F0"/>
+                <w:lang w:val="en-US"/>
+              </w:rPr>
+              <w:t xml:space="preserve">: </w:t>
+            </w:r>
+            <w:r>
+              <w:rPr>
+                <w:color w:val="00B0F0"/>
+              </w:rPr>
+              <w:t>Ввод</w:t>
             </w:r>
           </w:p>
         </w:tc>
@@ -10616,15 +10325,12 @@
             <w:pPr>
               <w:pStyle w:val="af0"/>
               <w:jc w:val="left"/>
-              <w:rPr>
-                <w:color w:val="00B0F0"/>
-              </w:rPr>
-            </w:pPr>
-            <w:r>
-              <w:rPr>
-                <w:color w:val="00B0F0"/>
-              </w:rPr>
-              <w:t>УВ / УВ: Оперативный вывод</w:t>
+            </w:pPr>
+            <w:r>
+              <w:t>ТО</w:t>
+            </w:r>
+            <w:r>
+              <w:t>: Оперативный вывод</w:t>
             </w:r>
           </w:p>
         </w:tc>
@@ -10709,7 +10415,7 @@
               <w:rPr>
                 <w:color w:val="00B0F0"/>
               </w:rPr>
-              <w:t>УВ / УВ: Включить</w:t>
+              <w:t>ТО: Пуск</w:t>
             </w:r>
           </w:p>
         </w:tc>
@@ -10797,7 +10503,7 @@
               <w:rPr>
                 <w:color w:val="00B0F0"/>
               </w:rPr>
-              <w:t>В: Отключить (реле)</w:t>
+              <w:t>ТО: ИО Iмакс</w:t>
             </w:r>
           </w:p>
         </w:tc>
@@ -10876,7 +10582,7 @@
               <w:rPr>
                 <w:color w:val="00B0F0"/>
               </w:rPr>
-              <w:t>В: Включить (реле)</w:t>
+              <w:t>ТО: Срабатывание сигн</w:t>
             </w:r>
           </w:p>
         </w:tc>
@@ -10954,7 +10660,7 @@
               <w:jc w:val="left"/>
             </w:pPr>
             <w:r>
-              <w:t>Резерв</w:t>
+              <w:t>ТО: Срабатывание</w:t>
             </w:r>
           </w:p>
         </w:tc>
@@ -11032,7 +10738,7 @@
               <w:jc w:val="left"/>
             </w:pPr>
             <w:r>
-              <w:t>Резерв</w:t>
+              <w:t>ЛО Т / ЛО: Срабатывание</w:t>
             </w:r>
           </w:p>
         </w:tc>
@@ -11104,7 +10810,7 @@
               <w:jc w:val="left"/>
             </w:pPr>
             <w:r>
-              <w:t>Резерв</w:t>
+              <w:t>ЛО Т / ЗАВР: Запрет АВР</w:t>
             </w:r>
           </w:p>
         </w:tc>
@@ -11170,7 +10876,7 @@
               <w:jc w:val="left"/>
             </w:pPr>
             <w:r>
-              <w:t>Резерв</w:t>
+              <w:t>ЛО Т / ЗАПВ: Запрет АПВ</w:t>
             </w:r>
           </w:p>
         </w:tc>
@@ -13819,8 +13525,6 @@
             <w:r>
               <w:t>Резерв</w:t>
             </w:r>
-            <w:bookmarkStart w:id="19" w:name="_GoBack"/>
-            <w:bookmarkEnd w:id="19"/>
           </w:p>
         </w:tc>
       </w:tr>
@@ -14371,9 +14075,21 @@
     <w:p>
       <w:pPr>
         <w:pStyle w:val="a"/>
+        <w:rPr>
+          <w:highlight w:val="cyan"/>
+        </w:rPr>
       </w:pPr>
       <w:r>
-        <w:t>Выходные реле устройства ЮНИТ-М300 для проверки МТЗ 1 ступени</w:t>
+        <w:rPr>
+          <w:highlight w:val="cyan"/>
+        </w:rPr>
+        <w:t xml:space="preserve">Выходные реле устройства ЮНИТ-М300 для проверки </w:t>
+      </w:r>
+      <w:r>
+        <w:rPr>
+          <w:highlight w:val="cyan"/>
+        </w:rPr>
+        <w:t>ТО РПН</w:t>
       </w:r>
     </w:p>
     <w:tbl>
@@ -14509,7 +14225,10 @@
               <w:jc w:val="left"/>
             </w:pPr>
             <w:r>
-              <w:t>МТЗ 1 ст: Ввод</w:t>
+              <w:t>ТО РПН</w:t>
+            </w:r>
+            <w:r>
+              <w:t>: Ввод</w:t>
             </w:r>
           </w:p>
         </w:tc>
@@ -14570,7 +14289,10 @@
               <w:jc w:val="left"/>
             </w:pPr>
             <w:r>
-              <w:t>МТЗ 1 ст: Оперативный вывод</w:t>
+              <w:t>ТО РПН</w:t>
+            </w:r>
+            <w:r>
+              <w:t>: Оперативный вывод</w:t>
             </w:r>
           </w:p>
         </w:tc>
@@ -14649,7 +14371,16 @@
               <w:jc w:val="left"/>
             </w:pPr>
             <w:r>
-              <w:t>МТЗ 1 ст: Пуск ф.А</w:t>
+              <w:t>ТО РПН</w:t>
+            </w:r>
+            <w:r>
+              <w:rPr>
+                <w:lang w:val="en-US"/>
+              </w:rPr>
+              <w:t xml:space="preserve">: </w:t>
+            </w:r>
+            <w:r>
+              <w:t>Пуск</w:t>
             </w:r>
           </w:p>
         </w:tc>
@@ -14731,7 +14462,22 @@
               <w:jc w:val="left"/>
             </w:pPr>
             <w:r>
-              <w:t>МТЗ 1 ст: Пуск ф.В</w:t>
+              <w:t>ТО РПН</w:t>
+            </w:r>
+            <w:r>
+              <w:rPr>
+                <w:lang w:val="en-US"/>
+              </w:rPr>
+              <w:t>:</w:t>
+            </w:r>
+            <w:r>
+              <w:t xml:space="preserve"> ИО </w:t>
+            </w:r>
+            <w:r>
+              <w:rPr>
+                <w:lang w:val="en-US"/>
+              </w:rPr>
+              <w:t>I</w:t>
             </w:r>
           </w:p>
         </w:tc>
@@ -14804,7 +14550,7 @@
               <w:jc w:val="left"/>
             </w:pPr>
             <w:r>
-              <w:t>МТЗ 1 ст: Пуск ф.С</w:t>
+              <w:t>ЛО Т / ЛО: Срабатывание</w:t>
             </w:r>
           </w:p>
         </w:tc>
@@ -14861,6 +14607,8 @@
                 <w:lang w:val="en-US"/>
               </w:rPr>
             </w:pPr>
+            <w:bookmarkStart w:id="19" w:name="_GoBack"/>
+            <w:bookmarkEnd w:id="19"/>
             <w:r>
               <w:t>М9.К</w:t>
             </w:r>
@@ -14882,7 +14630,7 @@
               <w:jc w:val="left"/>
             </w:pPr>
             <w:r>
-              <w:t>МТЗ 1 ст: Пуск</w:t>
+              <w:t>ЛО Т / ЗАВР: Запрет АВР</w:t>
             </w:r>
           </w:p>
         </w:tc>
@@ -14960,7 +14708,7 @@
               <w:jc w:val="left"/>
             </w:pPr>
             <w:r>
-              <w:t xml:space="preserve">МТЗ 1 ст: Срабатывание </w:t>
+              <w:t>ЛО Т / ЗАПВ: Запрет АПВ</w:t>
             </w:r>
           </w:p>
         </w:tc>
@@ -15032,7 +14780,7 @@
               <w:jc w:val="left"/>
             </w:pPr>
             <w:r>
-              <w:t>МТЗ 1 ст: Срабатывание сигн</w:t>
+              <w:t>Резерв</w:t>
             </w:r>
           </w:p>
         </w:tc>
@@ -15098,7 +14846,7 @@
               <w:jc w:val="left"/>
             </w:pPr>
             <w:r>
-              <w:t>МТЗ 1 ст: ИО IА</w:t>
+              <w:t>Резерв</w:t>
             </w:r>
           </w:p>
         </w:tc>
@@ -15158,7 +14906,7 @@
               <w:jc w:val="left"/>
             </w:pPr>
             <w:r>
-              <w:t>МТЗ 1 ст: ИО IВ</w:t>
+              <w:t>Резерв</w:t>
             </w:r>
           </w:p>
         </w:tc>
@@ -15233,7 +14981,7 @@
               <w:jc w:val="left"/>
             </w:pPr>
             <w:r>
-              <w:t>МТЗ 1 ст: ИО IС</w:t>
+              <w:t>Резерв</w:t>
             </w:r>
           </w:p>
         </w:tc>
@@ -15308,7 +15056,7 @@
               <w:jc w:val="left"/>
             </w:pPr>
             <w:r>
-              <w:t>ЛО Т / ЛО: Срабатывание</w:t>
+              <w:t>Резерв</w:t>
             </w:r>
           </w:p>
         </w:tc>
@@ -15374,7 +15122,7 @@
               <w:jc w:val="left"/>
             </w:pPr>
             <w:r>
-              <w:t>ЛО Т / ЗАПВ: Запрет АПВ</w:t>
+              <w:t>Резерв</w:t>
             </w:r>
           </w:p>
         </w:tc>
@@ -15446,7 +15194,7 @@
               <w:jc w:val="left"/>
             </w:pPr>
             <w:r>
-              <w:t>ЛО Т / ЗАВР: Запрет АВР</w:t>
+              <w:t>Резерв</w:t>
             </w:r>
           </w:p>
         </w:tc>
@@ -15518,16 +15266,7 @@
               <w:jc w:val="left"/>
             </w:pPr>
             <w:r>
-              <w:t>БЛЗШ</w:t>
-            </w:r>
-            <w:r>
-              <w:rPr>
-                <w:lang w:val="en-US"/>
-              </w:rPr>
-              <w:t xml:space="preserve">: </w:t>
-            </w:r>
-            <w:r>
-              <w:t>Блокировка</w:t>
+              <w:t>Резерв</w:t>
             </w:r>
           </w:p>
         </w:tc>
@@ -15593,7 +15332,7 @@
               <w:jc w:val="left"/>
             </w:pPr>
             <w:r>
-              <w:t>-</w:t>
+              <w:t>Резерв</w:t>
             </w:r>
           </w:p>
         </w:tc>
@@ -20931,7 +20670,7 @@
 </file>
 
 <file path=customXml/itemProps1.xml><?xml version="1.0" encoding="utf-8"?>
-<ds:datastoreItem xmlns:ds="http://schemas.openxmlformats.org/officeDocument/2006/customXml" ds:itemID="{76E020FB-E954-4A14-9F47-F7C0A6973273}">
+<ds:datastoreItem xmlns:ds="http://schemas.openxmlformats.org/officeDocument/2006/customXml" ds:itemID="{54EA5AC8-CF56-4DDF-B355-3D156568FBC0}">
   <ds:schemaRefs>
     <ds:schemaRef ds:uri="http://schemas.openxmlformats.org/officeDocument/2006/bibliography"/>
   </ds:schemaRefs>

</xml_diff>

<commit_message>
fix tokz. inner signals from MTZ deleted (pusk st)
</commit_message>
<xml_diff>
--- a/mode_docx_gen/pmi_tokz/template.docx
+++ b/mode_docx_gen/pmi_tokz/template.docx
@@ -463,7 +463,7 @@
       <w:r>
         <w:fldChar w:fldCharType="separate"/>
       </w:r>
-      <w:hyperlink w:anchor="_Toc193874820" w:history="1">
+      <w:hyperlink w:anchor="_Toc193875604" w:history="1">
         <w:r>
           <w:rPr>
             <w:rStyle w:val="af4"/>
@@ -507,7 +507,7 @@
             <w:noProof/>
             <w:webHidden/>
           </w:rPr>
-          <w:instrText xml:space="preserve"> PAGEREF _Toc193874820 \h </w:instrText>
+          <w:instrText xml:space="preserve"> PAGEREF _Toc193875604 \h </w:instrText>
         </w:r>
         <w:r>
           <w:rPr>
@@ -549,7 +549,7 @@
           <w:lang w:val="en-US"/>
         </w:rPr>
       </w:pPr>
-      <w:hyperlink w:anchor="_Toc193874821" w:history="1">
+      <w:hyperlink w:anchor="_Toc193875605" w:history="1">
         <w:r>
           <w:rPr>
             <w:rStyle w:val="af4"/>
@@ -576,7 +576,7 @@
             <w:noProof/>
             <w:webHidden/>
           </w:rPr>
-          <w:instrText xml:space="preserve"> PAGEREF _Toc193874821 \h </w:instrText>
+          <w:instrText xml:space="preserve"> PAGEREF _Toc193875605 \h </w:instrText>
         </w:r>
         <w:r>
           <w:rPr>
@@ -618,7 +618,7 @@
           <w:lang w:val="en-US"/>
         </w:rPr>
       </w:pPr>
-      <w:hyperlink w:anchor="_Toc193874822" w:history="1">
+      <w:hyperlink w:anchor="_Toc193875606" w:history="1">
         <w:r>
           <w:rPr>
             <w:rStyle w:val="af4"/>
@@ -645,7 +645,7 @@
             <w:noProof/>
             <w:webHidden/>
           </w:rPr>
-          <w:instrText xml:space="preserve"> PAGEREF _Toc193874822 \h </w:instrText>
+          <w:instrText xml:space="preserve"> PAGEREF _Toc193875606 \h </w:instrText>
         </w:r>
         <w:r>
           <w:rPr>
@@ -687,7 +687,7 @@
           <w:lang w:val="en-US"/>
         </w:rPr>
       </w:pPr>
-      <w:hyperlink w:anchor="_Toc193874823" w:history="1">
+      <w:hyperlink w:anchor="_Toc193875607" w:history="1">
         <w:r>
           <w:rPr>
             <w:rStyle w:val="af4"/>
@@ -714,7 +714,7 @@
             <w:noProof/>
             <w:webHidden/>
           </w:rPr>
-          <w:instrText xml:space="preserve"> PAGEREF _Toc193874823 \h </w:instrText>
+          <w:instrText xml:space="preserve"> PAGEREF _Toc193875607 \h </w:instrText>
         </w:r>
         <w:r>
           <w:rPr>
@@ -756,7 +756,7 @@
           <w:lang w:val="en-US"/>
         </w:rPr>
       </w:pPr>
-      <w:hyperlink w:anchor="_Toc193874824" w:history="1">
+      <w:hyperlink w:anchor="_Toc193875608" w:history="1">
         <w:r>
           <w:rPr>
             <w:rStyle w:val="af4"/>
@@ -783,7 +783,7 @@
             <w:noProof/>
             <w:webHidden/>
           </w:rPr>
-          <w:instrText xml:space="preserve"> PAGEREF _Toc193874824 \h </w:instrText>
+          <w:instrText xml:space="preserve"> PAGEREF _Toc193875608 \h </w:instrText>
         </w:r>
         <w:r>
           <w:rPr>
@@ -825,7 +825,7 @@
           <w:lang w:val="en-US"/>
         </w:rPr>
       </w:pPr>
-      <w:hyperlink w:anchor="_Toc193874825" w:history="1">
+      <w:hyperlink w:anchor="_Toc193875609" w:history="1">
         <w:r>
           <w:rPr>
             <w:rStyle w:val="af4"/>
@@ -852,7 +852,7 @@
             <w:noProof/>
             <w:webHidden/>
           </w:rPr>
-          <w:instrText xml:space="preserve"> PAGEREF _Toc193874825 \h </w:instrText>
+          <w:instrText xml:space="preserve"> PAGEREF _Toc193875609 \h </w:instrText>
         </w:r>
         <w:r>
           <w:rPr>
@@ -894,7 +894,7 @@
           <w:lang w:val="en-US"/>
         </w:rPr>
       </w:pPr>
-      <w:hyperlink w:anchor="_Toc193874826" w:history="1">
+      <w:hyperlink w:anchor="_Toc193875610" w:history="1">
         <w:r>
           <w:rPr>
             <w:rStyle w:val="af4"/>
@@ -921,7 +921,7 @@
             <w:noProof/>
             <w:webHidden/>
           </w:rPr>
-          <w:instrText xml:space="preserve"> PAGEREF _Toc193874826 \h </w:instrText>
+          <w:instrText xml:space="preserve"> PAGEREF _Toc193875610 \h </w:instrText>
         </w:r>
         <w:r>
           <w:rPr>
@@ -963,7 +963,7 @@
           <w:lang w:val="en-US"/>
         </w:rPr>
       </w:pPr>
-      <w:hyperlink w:anchor="_Toc193874827" w:history="1">
+      <w:hyperlink w:anchor="_Toc193875611" w:history="1">
         <w:r>
           <w:rPr>
             <w:rStyle w:val="af4"/>
@@ -990,7 +990,7 @@
             <w:noProof/>
             <w:webHidden/>
           </w:rPr>
-          <w:instrText xml:space="preserve"> PAGEREF _Toc193874827 \h </w:instrText>
+          <w:instrText xml:space="preserve"> PAGEREF _Toc193875611 \h </w:instrText>
         </w:r>
         <w:r>
           <w:rPr>
@@ -1036,7 +1036,7 @@
           <w:lang w:val="en-US"/>
         </w:rPr>
       </w:pPr>
-      <w:hyperlink w:anchor="_Toc193874828" w:history="1">
+      <w:hyperlink w:anchor="_Toc193875612" w:history="1">
         <w:r>
           <w:rPr>
             <w:rStyle w:val="af4"/>
@@ -1080,7 +1080,7 @@
             <w:noProof/>
             <w:webHidden/>
           </w:rPr>
-          <w:instrText xml:space="preserve"> PAGEREF _Toc193874828 \h </w:instrText>
+          <w:instrText xml:space="preserve"> PAGEREF _Toc193875612 \h </w:instrText>
         </w:r>
         <w:r>
           <w:rPr>
@@ -1122,7 +1122,7 @@
           <w:lang w:val="en-US"/>
         </w:rPr>
       </w:pPr>
-      <w:hyperlink w:anchor="_Toc193874829" w:history="1">
+      <w:hyperlink w:anchor="_Toc193875613" w:history="1">
         <w:r>
           <w:rPr>
             <w:rStyle w:val="af4"/>
@@ -1149,7 +1149,7 @@
             <w:noProof/>
             <w:webHidden/>
           </w:rPr>
-          <w:instrText xml:space="preserve"> PAGEREF _Toc193874829 \h </w:instrText>
+          <w:instrText xml:space="preserve"> PAGEREF _Toc193875613 \h </w:instrText>
         </w:r>
         <w:r>
           <w:rPr>
@@ -1191,7 +1191,7 @@
           <w:lang w:val="en-US"/>
         </w:rPr>
       </w:pPr>
-      <w:hyperlink w:anchor="_Toc193874830" w:history="1">
+      <w:hyperlink w:anchor="_Toc193875614" w:history="1">
         <w:r>
           <w:rPr>
             <w:rStyle w:val="af4"/>
@@ -1218,7 +1218,7 @@
             <w:noProof/>
             <w:webHidden/>
           </w:rPr>
-          <w:instrText xml:space="preserve"> PAGEREF _Toc193874830 \h </w:instrText>
+          <w:instrText xml:space="preserve"> PAGEREF _Toc193875614 \h </w:instrText>
         </w:r>
         <w:r>
           <w:rPr>
@@ -1260,7 +1260,7 @@
           <w:lang w:val="en-US"/>
         </w:rPr>
       </w:pPr>
-      <w:hyperlink w:anchor="_Toc193874831" w:history="1">
+      <w:hyperlink w:anchor="_Toc193875615" w:history="1">
         <w:r>
           <w:rPr>
             <w:rStyle w:val="af4"/>
@@ -1287,7 +1287,7 @@
             <w:noProof/>
             <w:webHidden/>
           </w:rPr>
-          <w:instrText xml:space="preserve"> PAGEREF _Toc193874831 \h </w:instrText>
+          <w:instrText xml:space="preserve"> PAGEREF _Toc193875615 \h </w:instrText>
         </w:r>
         <w:r>
           <w:rPr>
@@ -1329,7 +1329,7 @@
           <w:lang w:val="en-US"/>
         </w:rPr>
       </w:pPr>
-      <w:hyperlink w:anchor="_Toc193874832" w:history="1">
+      <w:hyperlink w:anchor="_Toc193875616" w:history="1">
         <w:r>
           <w:rPr>
             <w:rStyle w:val="af4"/>
@@ -1356,7 +1356,7 @@
             <w:noProof/>
             <w:webHidden/>
           </w:rPr>
-          <w:instrText xml:space="preserve"> PAGEREF _Toc193874832 \h </w:instrText>
+          <w:instrText xml:space="preserve"> PAGEREF _Toc193875616 \h </w:instrText>
         </w:r>
         <w:r>
           <w:rPr>
@@ -1398,7 +1398,7 @@
           <w:lang w:val="en-US"/>
         </w:rPr>
       </w:pPr>
-      <w:hyperlink w:anchor="_Toc193874833" w:history="1">
+      <w:hyperlink w:anchor="_Toc193875617" w:history="1">
         <w:r>
           <w:rPr>
             <w:rStyle w:val="af4"/>
@@ -1425,7 +1425,7 @@
             <w:noProof/>
             <w:webHidden/>
           </w:rPr>
-          <w:instrText xml:space="preserve"> PAGEREF _Toc193874833 \h </w:instrText>
+          <w:instrText xml:space="preserve"> PAGEREF _Toc193875617 \h </w:instrText>
         </w:r>
         <w:r>
           <w:rPr>
@@ -1446,6 +1446,924 @@
             <w:webHidden/>
           </w:rPr>
           <w:t>8</w:t>
+        </w:r>
+        <w:r>
+          <w:rPr>
+            <w:noProof/>
+            <w:webHidden/>
+          </w:rPr>
+          <w:fldChar w:fldCharType="end"/>
+        </w:r>
+      </w:hyperlink>
+    </w:p>
+    <w:p>
+      <w:pPr>
+        <w:pStyle w:val="22"/>
+        <w:rPr>
+          <w:rFonts w:asciiTheme="minorHAnsi" w:eastAsiaTheme="minorEastAsia" w:hAnsiTheme="minorHAnsi"/>
+          <w:noProof/>
+          <w:color w:val="auto"/>
+          <w:sz w:val="22"/>
+          <w:lang w:val="en-US"/>
+        </w:rPr>
+      </w:pPr>
+      <w:hyperlink w:anchor="_Toc193875618" w:history="1">
+        <w:r>
+          <w:rPr>
+            <w:rStyle w:val="af4"/>
+            <w:noProof/>
+          </w:rPr>
+          <w:t>2.6 Проверка функции ЛЗТ</w:t>
+        </w:r>
+        <w:r>
+          <w:rPr>
+            <w:noProof/>
+            <w:webHidden/>
+          </w:rPr>
+          <w:tab/>
+        </w:r>
+        <w:r>
+          <w:rPr>
+            <w:noProof/>
+            <w:webHidden/>
+          </w:rPr>
+          <w:fldChar w:fldCharType="begin"/>
+        </w:r>
+        <w:r>
+          <w:rPr>
+            <w:noProof/>
+            <w:webHidden/>
+          </w:rPr>
+          <w:instrText xml:space="preserve"> PAGEREF _Toc193875618 \h </w:instrText>
+        </w:r>
+        <w:r>
+          <w:rPr>
+            <w:noProof/>
+            <w:webHidden/>
+          </w:rPr>
+        </w:r>
+        <w:r>
+          <w:rPr>
+            <w:noProof/>
+            <w:webHidden/>
+          </w:rPr>
+          <w:fldChar w:fldCharType="separate"/>
+        </w:r>
+        <w:r>
+          <w:rPr>
+            <w:noProof/>
+            <w:webHidden/>
+          </w:rPr>
+          <w:t>10</w:t>
+        </w:r>
+        <w:r>
+          <w:rPr>
+            <w:noProof/>
+            <w:webHidden/>
+          </w:rPr>
+          <w:fldChar w:fldCharType="end"/>
+        </w:r>
+      </w:hyperlink>
+    </w:p>
+    <w:p>
+      <w:pPr>
+        <w:pStyle w:val="22"/>
+        <w:rPr>
+          <w:rFonts w:asciiTheme="minorHAnsi" w:eastAsiaTheme="minorEastAsia" w:hAnsiTheme="minorHAnsi"/>
+          <w:noProof/>
+          <w:color w:val="auto"/>
+          <w:sz w:val="22"/>
+          <w:lang w:val="en-US"/>
+        </w:rPr>
+      </w:pPr>
+      <w:hyperlink w:anchor="_Toc193875619" w:history="1">
+        <w:r>
+          <w:rPr>
+            <w:rStyle w:val="af4"/>
+            <w:noProof/>
+          </w:rPr>
+          <w:t>2.7 Проверка функции ТК ЗДЗ</w:t>
+        </w:r>
+        <w:r>
+          <w:rPr>
+            <w:noProof/>
+            <w:webHidden/>
+          </w:rPr>
+          <w:tab/>
+        </w:r>
+        <w:r>
+          <w:rPr>
+            <w:noProof/>
+            <w:webHidden/>
+          </w:rPr>
+          <w:fldChar w:fldCharType="begin"/>
+        </w:r>
+        <w:r>
+          <w:rPr>
+            <w:noProof/>
+            <w:webHidden/>
+          </w:rPr>
+          <w:instrText xml:space="preserve"> PAGEREF _Toc193875619 \h </w:instrText>
+        </w:r>
+        <w:r>
+          <w:rPr>
+            <w:noProof/>
+            <w:webHidden/>
+          </w:rPr>
+        </w:r>
+        <w:r>
+          <w:rPr>
+            <w:noProof/>
+            <w:webHidden/>
+          </w:rPr>
+          <w:fldChar w:fldCharType="separate"/>
+        </w:r>
+        <w:r>
+          <w:rPr>
+            <w:noProof/>
+            <w:webHidden/>
+          </w:rPr>
+          <w:t>14</w:t>
+        </w:r>
+        <w:r>
+          <w:rPr>
+            <w:noProof/>
+            <w:webHidden/>
+          </w:rPr>
+          <w:fldChar w:fldCharType="end"/>
+        </w:r>
+      </w:hyperlink>
+    </w:p>
+    <w:p>
+      <w:pPr>
+        <w:pStyle w:val="22"/>
+        <w:rPr>
+          <w:rFonts w:asciiTheme="minorHAnsi" w:eastAsiaTheme="minorEastAsia" w:hAnsiTheme="minorHAnsi"/>
+          <w:noProof/>
+          <w:color w:val="auto"/>
+          <w:sz w:val="22"/>
+          <w:lang w:val="en-US"/>
+        </w:rPr>
+      </w:pPr>
+      <w:hyperlink w:anchor="_Toc193875620" w:history="1">
+        <w:r>
+          <w:rPr>
+            <w:rStyle w:val="af4"/>
+            <w:noProof/>
+          </w:rPr>
+          <w:t>2.8 Проверка функции ТО</w:t>
+        </w:r>
+        <w:r>
+          <w:rPr>
+            <w:noProof/>
+            <w:webHidden/>
+          </w:rPr>
+          <w:tab/>
+        </w:r>
+        <w:r>
+          <w:rPr>
+            <w:noProof/>
+            <w:webHidden/>
+          </w:rPr>
+          <w:fldChar w:fldCharType="begin"/>
+        </w:r>
+        <w:r>
+          <w:rPr>
+            <w:noProof/>
+            <w:webHidden/>
+          </w:rPr>
+          <w:instrText xml:space="preserve"> PAGEREF _Toc193875620 \h </w:instrText>
+        </w:r>
+        <w:r>
+          <w:rPr>
+            <w:noProof/>
+            <w:webHidden/>
+          </w:rPr>
+        </w:r>
+        <w:r>
+          <w:rPr>
+            <w:noProof/>
+            <w:webHidden/>
+          </w:rPr>
+          <w:fldChar w:fldCharType="separate"/>
+        </w:r>
+        <w:r>
+          <w:rPr>
+            <w:noProof/>
+            <w:webHidden/>
+          </w:rPr>
+          <w:t>18</w:t>
+        </w:r>
+        <w:r>
+          <w:rPr>
+            <w:noProof/>
+            <w:webHidden/>
+          </w:rPr>
+          <w:fldChar w:fldCharType="end"/>
+        </w:r>
+      </w:hyperlink>
+    </w:p>
+    <w:p>
+      <w:pPr>
+        <w:pStyle w:val="22"/>
+        <w:rPr>
+          <w:rFonts w:asciiTheme="minorHAnsi" w:eastAsiaTheme="minorEastAsia" w:hAnsiTheme="minorHAnsi"/>
+          <w:noProof/>
+          <w:color w:val="auto"/>
+          <w:sz w:val="22"/>
+          <w:lang w:val="en-US"/>
+        </w:rPr>
+      </w:pPr>
+      <w:hyperlink w:anchor="_Toc193875621" w:history="1">
+        <w:r>
+          <w:rPr>
+            <w:rStyle w:val="af4"/>
+            <w:noProof/>
+          </w:rPr>
+          <w:t>2.9 Проверка функции ТО РПН</w:t>
+        </w:r>
+        <w:r>
+          <w:rPr>
+            <w:noProof/>
+            <w:webHidden/>
+          </w:rPr>
+          <w:tab/>
+        </w:r>
+        <w:r>
+          <w:rPr>
+            <w:noProof/>
+            <w:webHidden/>
+          </w:rPr>
+          <w:fldChar w:fldCharType="begin"/>
+        </w:r>
+        <w:r>
+          <w:rPr>
+            <w:noProof/>
+            <w:webHidden/>
+          </w:rPr>
+          <w:instrText xml:space="preserve"> PAGEREF _Toc193875621 \h </w:instrText>
+        </w:r>
+        <w:r>
+          <w:rPr>
+            <w:noProof/>
+            <w:webHidden/>
+          </w:rPr>
+        </w:r>
+        <w:r>
+          <w:rPr>
+            <w:noProof/>
+            <w:webHidden/>
+          </w:rPr>
+          <w:fldChar w:fldCharType="separate"/>
+        </w:r>
+        <w:r>
+          <w:rPr>
+            <w:noProof/>
+            <w:webHidden/>
+          </w:rPr>
+          <w:t>21</w:t>
+        </w:r>
+        <w:r>
+          <w:rPr>
+            <w:noProof/>
+            <w:webHidden/>
+          </w:rPr>
+          <w:fldChar w:fldCharType="end"/>
+        </w:r>
+      </w:hyperlink>
+    </w:p>
+    <w:p>
+      <w:pPr>
+        <w:pStyle w:val="22"/>
+        <w:rPr>
+          <w:rFonts w:asciiTheme="minorHAnsi" w:eastAsiaTheme="minorEastAsia" w:hAnsiTheme="minorHAnsi"/>
+          <w:noProof/>
+          <w:color w:val="auto"/>
+          <w:sz w:val="22"/>
+          <w:lang w:val="en-US"/>
+        </w:rPr>
+      </w:pPr>
+      <w:hyperlink w:anchor="_Toc193875622" w:history="1">
+        <w:r>
+          <w:rPr>
+            <w:rStyle w:val="af4"/>
+            <w:noProof/>
+          </w:rPr>
+          <w:t>2.10 Проверка функции ЗОП</w:t>
+        </w:r>
+        <w:r>
+          <w:rPr>
+            <w:noProof/>
+            <w:webHidden/>
+          </w:rPr>
+          <w:tab/>
+        </w:r>
+        <w:r>
+          <w:rPr>
+            <w:noProof/>
+            <w:webHidden/>
+          </w:rPr>
+          <w:fldChar w:fldCharType="begin"/>
+        </w:r>
+        <w:r>
+          <w:rPr>
+            <w:noProof/>
+            <w:webHidden/>
+          </w:rPr>
+          <w:instrText xml:space="preserve"> PAGEREF _Toc193875622 \h </w:instrText>
+        </w:r>
+        <w:r>
+          <w:rPr>
+            <w:noProof/>
+            <w:webHidden/>
+          </w:rPr>
+        </w:r>
+        <w:r>
+          <w:rPr>
+            <w:noProof/>
+            <w:webHidden/>
+          </w:rPr>
+          <w:fldChar w:fldCharType="separate"/>
+        </w:r>
+        <w:r>
+          <w:rPr>
+            <w:noProof/>
+            <w:webHidden/>
+          </w:rPr>
+          <w:t>24</w:t>
+        </w:r>
+        <w:r>
+          <w:rPr>
+            <w:noProof/>
+            <w:webHidden/>
+          </w:rPr>
+          <w:fldChar w:fldCharType="end"/>
+        </w:r>
+      </w:hyperlink>
+    </w:p>
+    <w:p>
+      <w:pPr>
+        <w:pStyle w:val="22"/>
+        <w:rPr>
+          <w:rFonts w:asciiTheme="minorHAnsi" w:eastAsiaTheme="minorEastAsia" w:hAnsiTheme="minorHAnsi"/>
+          <w:noProof/>
+          <w:color w:val="auto"/>
+          <w:sz w:val="22"/>
+          <w:lang w:val="en-US"/>
+        </w:rPr>
+      </w:pPr>
+      <w:hyperlink w:anchor="_Toc193875623" w:history="1">
+        <w:r>
+          <w:rPr>
+            <w:rStyle w:val="af4"/>
+            <w:noProof/>
+          </w:rPr>
+          <w:t>2.11 Проверка функции ЗП</w:t>
+        </w:r>
+        <w:r>
+          <w:rPr>
+            <w:noProof/>
+            <w:webHidden/>
+          </w:rPr>
+          <w:tab/>
+        </w:r>
+        <w:r>
+          <w:rPr>
+            <w:noProof/>
+            <w:webHidden/>
+          </w:rPr>
+          <w:fldChar w:fldCharType="begin"/>
+        </w:r>
+        <w:r>
+          <w:rPr>
+            <w:noProof/>
+            <w:webHidden/>
+          </w:rPr>
+          <w:instrText xml:space="preserve"> PAGEREF _Toc193875623 \h </w:instrText>
+        </w:r>
+        <w:r>
+          <w:rPr>
+            <w:noProof/>
+            <w:webHidden/>
+          </w:rPr>
+        </w:r>
+        <w:r>
+          <w:rPr>
+            <w:noProof/>
+            <w:webHidden/>
+          </w:rPr>
+          <w:fldChar w:fldCharType="separate"/>
+        </w:r>
+        <w:r>
+          <w:rPr>
+            <w:noProof/>
+            <w:webHidden/>
+          </w:rPr>
+          <w:t>28</w:t>
+        </w:r>
+        <w:r>
+          <w:rPr>
+            <w:noProof/>
+            <w:webHidden/>
+          </w:rPr>
+          <w:fldChar w:fldCharType="end"/>
+        </w:r>
+      </w:hyperlink>
+    </w:p>
+    <w:p>
+      <w:pPr>
+        <w:pStyle w:val="12"/>
+        <w:tabs>
+          <w:tab w:val="left" w:pos="567"/>
+          <w:tab w:val="right" w:leader="dot" w:pos="9605"/>
+        </w:tabs>
+        <w:rPr>
+          <w:rFonts w:asciiTheme="minorHAnsi" w:eastAsiaTheme="minorEastAsia" w:hAnsiTheme="minorHAnsi"/>
+          <w:noProof/>
+          <w:color w:val="auto"/>
+          <w:sz w:val="22"/>
+          <w:lang w:val="en-US"/>
+        </w:rPr>
+      </w:pPr>
+      <w:hyperlink w:anchor="_Toc193875624" w:history="1">
+        <w:r>
+          <w:rPr>
+            <w:rStyle w:val="af4"/>
+            <w:noProof/>
+          </w:rPr>
+          <w:t>3.</w:t>
+        </w:r>
+        <w:r>
+          <w:rPr>
+            <w:rFonts w:asciiTheme="minorHAnsi" w:eastAsiaTheme="minorEastAsia" w:hAnsiTheme="minorHAnsi"/>
+            <w:noProof/>
+            <w:color w:val="auto"/>
+            <w:sz w:val="22"/>
+            <w:lang w:val="en-US"/>
+          </w:rPr>
+          <w:tab/>
+        </w:r>
+        <w:r>
+          <w:rPr>
+            <w:rStyle w:val="af4"/>
+            <w:noProof/>
+          </w:rPr>
+          <w:t>РЕЗУЛЬТАТ ИСПЫТАНИЙ</w:t>
+        </w:r>
+        <w:r>
+          <w:rPr>
+            <w:noProof/>
+            <w:webHidden/>
+          </w:rPr>
+          <w:tab/>
+        </w:r>
+        <w:r>
+          <w:rPr>
+            <w:noProof/>
+            <w:webHidden/>
+          </w:rPr>
+          <w:fldChar w:fldCharType="begin"/>
+        </w:r>
+        <w:r>
+          <w:rPr>
+            <w:noProof/>
+            <w:webHidden/>
+          </w:rPr>
+          <w:instrText xml:space="preserve"> PAGEREF _Toc193875624 \h </w:instrText>
+        </w:r>
+        <w:r>
+          <w:rPr>
+            <w:noProof/>
+            <w:webHidden/>
+          </w:rPr>
+        </w:r>
+        <w:r>
+          <w:rPr>
+            <w:noProof/>
+            <w:webHidden/>
+          </w:rPr>
+          <w:fldChar w:fldCharType="separate"/>
+        </w:r>
+        <w:r>
+          <w:rPr>
+            <w:noProof/>
+            <w:webHidden/>
+          </w:rPr>
+          <w:t>32</w:t>
+        </w:r>
+        <w:r>
+          <w:rPr>
+            <w:noProof/>
+            <w:webHidden/>
+          </w:rPr>
+          <w:fldChar w:fldCharType="end"/>
+        </w:r>
+      </w:hyperlink>
+    </w:p>
+    <w:p>
+      <w:pPr>
+        <w:pStyle w:val="22"/>
+        <w:rPr>
+          <w:rFonts w:asciiTheme="minorHAnsi" w:eastAsiaTheme="minorEastAsia" w:hAnsiTheme="minorHAnsi"/>
+          <w:noProof/>
+          <w:color w:val="auto"/>
+          <w:sz w:val="22"/>
+          <w:lang w:val="en-US"/>
+        </w:rPr>
+      </w:pPr>
+      <w:hyperlink w:anchor="_Toc193875625" w:history="1">
+        <w:r>
+          <w:rPr>
+            <w:rStyle w:val="af4"/>
+            <w:noProof/>
+          </w:rPr>
+          <w:t>3.1 Результат проверки функции ЛЗТ</w:t>
+        </w:r>
+        <w:r>
+          <w:rPr>
+            <w:noProof/>
+            <w:webHidden/>
+          </w:rPr>
+          <w:tab/>
+        </w:r>
+        <w:r>
+          <w:rPr>
+            <w:noProof/>
+            <w:webHidden/>
+          </w:rPr>
+          <w:fldChar w:fldCharType="begin"/>
+        </w:r>
+        <w:r>
+          <w:rPr>
+            <w:noProof/>
+            <w:webHidden/>
+          </w:rPr>
+          <w:instrText xml:space="preserve"> PAGEREF _Toc193875625 \h </w:instrText>
+        </w:r>
+        <w:r>
+          <w:rPr>
+            <w:noProof/>
+            <w:webHidden/>
+          </w:rPr>
+        </w:r>
+        <w:r>
+          <w:rPr>
+            <w:noProof/>
+            <w:webHidden/>
+          </w:rPr>
+          <w:fldChar w:fldCharType="separate"/>
+        </w:r>
+        <w:r>
+          <w:rPr>
+            <w:noProof/>
+            <w:webHidden/>
+          </w:rPr>
+          <w:t>32</w:t>
+        </w:r>
+        <w:r>
+          <w:rPr>
+            <w:noProof/>
+            <w:webHidden/>
+          </w:rPr>
+          <w:fldChar w:fldCharType="end"/>
+        </w:r>
+      </w:hyperlink>
+    </w:p>
+    <w:p>
+      <w:pPr>
+        <w:pStyle w:val="22"/>
+        <w:rPr>
+          <w:rFonts w:asciiTheme="minorHAnsi" w:eastAsiaTheme="minorEastAsia" w:hAnsiTheme="minorHAnsi"/>
+          <w:noProof/>
+          <w:color w:val="auto"/>
+          <w:sz w:val="22"/>
+          <w:lang w:val="en-US"/>
+        </w:rPr>
+      </w:pPr>
+      <w:hyperlink w:anchor="_Toc193875626" w:history="1">
+        <w:r>
+          <w:rPr>
+            <w:rStyle w:val="af4"/>
+            <w:noProof/>
+          </w:rPr>
+          <w:t>3.2 Результат проверки функции ТК ЗДЗ</w:t>
+        </w:r>
+        <w:r>
+          <w:rPr>
+            <w:noProof/>
+            <w:webHidden/>
+          </w:rPr>
+          <w:tab/>
+        </w:r>
+        <w:r>
+          <w:rPr>
+            <w:noProof/>
+            <w:webHidden/>
+          </w:rPr>
+          <w:fldChar w:fldCharType="begin"/>
+        </w:r>
+        <w:r>
+          <w:rPr>
+            <w:noProof/>
+            <w:webHidden/>
+          </w:rPr>
+          <w:instrText xml:space="preserve"> PAGEREF _Toc193875626 \h </w:instrText>
+        </w:r>
+        <w:r>
+          <w:rPr>
+            <w:noProof/>
+            <w:webHidden/>
+          </w:rPr>
+        </w:r>
+        <w:r>
+          <w:rPr>
+            <w:noProof/>
+            <w:webHidden/>
+          </w:rPr>
+          <w:fldChar w:fldCharType="separate"/>
+        </w:r>
+        <w:r>
+          <w:rPr>
+            <w:noProof/>
+            <w:webHidden/>
+          </w:rPr>
+          <w:t>32</w:t>
+        </w:r>
+        <w:r>
+          <w:rPr>
+            <w:noProof/>
+            <w:webHidden/>
+          </w:rPr>
+          <w:fldChar w:fldCharType="end"/>
+        </w:r>
+      </w:hyperlink>
+    </w:p>
+    <w:p>
+      <w:pPr>
+        <w:pStyle w:val="22"/>
+        <w:rPr>
+          <w:rFonts w:asciiTheme="minorHAnsi" w:eastAsiaTheme="minorEastAsia" w:hAnsiTheme="minorHAnsi"/>
+          <w:noProof/>
+          <w:color w:val="auto"/>
+          <w:sz w:val="22"/>
+          <w:lang w:val="en-US"/>
+        </w:rPr>
+      </w:pPr>
+      <w:hyperlink w:anchor="_Toc193875627" w:history="1">
+        <w:r>
+          <w:rPr>
+            <w:rStyle w:val="af4"/>
+            <w:noProof/>
+          </w:rPr>
+          <w:t>3.3 Результат проверки функции ТО</w:t>
+        </w:r>
+        <w:r>
+          <w:rPr>
+            <w:noProof/>
+            <w:webHidden/>
+          </w:rPr>
+          <w:tab/>
+        </w:r>
+        <w:r>
+          <w:rPr>
+            <w:noProof/>
+            <w:webHidden/>
+          </w:rPr>
+          <w:fldChar w:fldCharType="begin"/>
+        </w:r>
+        <w:r>
+          <w:rPr>
+            <w:noProof/>
+            <w:webHidden/>
+          </w:rPr>
+          <w:instrText xml:space="preserve"> PAGEREF _Toc193875627 \h </w:instrText>
+        </w:r>
+        <w:r>
+          <w:rPr>
+            <w:noProof/>
+            <w:webHidden/>
+          </w:rPr>
+        </w:r>
+        <w:r>
+          <w:rPr>
+            <w:noProof/>
+            <w:webHidden/>
+          </w:rPr>
+          <w:fldChar w:fldCharType="separate"/>
+        </w:r>
+        <w:r>
+          <w:rPr>
+            <w:noProof/>
+            <w:webHidden/>
+          </w:rPr>
+          <w:t>33</w:t>
+        </w:r>
+        <w:r>
+          <w:rPr>
+            <w:noProof/>
+            <w:webHidden/>
+          </w:rPr>
+          <w:fldChar w:fldCharType="end"/>
+        </w:r>
+      </w:hyperlink>
+    </w:p>
+    <w:p>
+      <w:pPr>
+        <w:pStyle w:val="22"/>
+        <w:rPr>
+          <w:rFonts w:asciiTheme="minorHAnsi" w:eastAsiaTheme="minorEastAsia" w:hAnsiTheme="minorHAnsi"/>
+          <w:noProof/>
+          <w:color w:val="auto"/>
+          <w:sz w:val="22"/>
+          <w:lang w:val="en-US"/>
+        </w:rPr>
+      </w:pPr>
+      <w:hyperlink w:anchor="_Toc193875628" w:history="1">
+        <w:r>
+          <w:rPr>
+            <w:rStyle w:val="af4"/>
+            <w:noProof/>
+          </w:rPr>
+          <w:t>3.4 Результат проверки функции ТО РПН</w:t>
+        </w:r>
+        <w:r>
+          <w:rPr>
+            <w:noProof/>
+            <w:webHidden/>
+          </w:rPr>
+          <w:tab/>
+        </w:r>
+        <w:r>
+          <w:rPr>
+            <w:noProof/>
+            <w:webHidden/>
+          </w:rPr>
+          <w:fldChar w:fldCharType="begin"/>
+        </w:r>
+        <w:r>
+          <w:rPr>
+            <w:noProof/>
+            <w:webHidden/>
+          </w:rPr>
+          <w:instrText xml:space="preserve"> PAGEREF _Toc193875628 \h </w:instrText>
+        </w:r>
+        <w:r>
+          <w:rPr>
+            <w:noProof/>
+            <w:webHidden/>
+          </w:rPr>
+        </w:r>
+        <w:r>
+          <w:rPr>
+            <w:noProof/>
+            <w:webHidden/>
+          </w:rPr>
+          <w:fldChar w:fldCharType="separate"/>
+        </w:r>
+        <w:r>
+          <w:rPr>
+            <w:noProof/>
+            <w:webHidden/>
+          </w:rPr>
+          <w:t>34</w:t>
+        </w:r>
+        <w:r>
+          <w:rPr>
+            <w:noProof/>
+            <w:webHidden/>
+          </w:rPr>
+          <w:fldChar w:fldCharType="end"/>
+        </w:r>
+      </w:hyperlink>
+    </w:p>
+    <w:p>
+      <w:pPr>
+        <w:pStyle w:val="22"/>
+        <w:rPr>
+          <w:rFonts w:asciiTheme="minorHAnsi" w:eastAsiaTheme="minorEastAsia" w:hAnsiTheme="minorHAnsi"/>
+          <w:noProof/>
+          <w:color w:val="auto"/>
+          <w:sz w:val="22"/>
+          <w:lang w:val="en-US"/>
+        </w:rPr>
+      </w:pPr>
+      <w:hyperlink w:anchor="_Toc193875629" w:history="1">
+        <w:r>
+          <w:rPr>
+            <w:rStyle w:val="af4"/>
+            <w:noProof/>
+          </w:rPr>
+          <w:t>3.5 Результат проверки функции ЗОП</w:t>
+        </w:r>
+        <w:r>
+          <w:rPr>
+            <w:noProof/>
+            <w:webHidden/>
+          </w:rPr>
+          <w:tab/>
+        </w:r>
+        <w:r>
+          <w:rPr>
+            <w:noProof/>
+            <w:webHidden/>
+          </w:rPr>
+          <w:fldChar w:fldCharType="begin"/>
+        </w:r>
+        <w:r>
+          <w:rPr>
+            <w:noProof/>
+            <w:webHidden/>
+          </w:rPr>
+          <w:instrText xml:space="preserve"> PAGEREF _Toc193875629 \h </w:instrText>
+        </w:r>
+        <w:r>
+          <w:rPr>
+            <w:noProof/>
+            <w:webHidden/>
+          </w:rPr>
+        </w:r>
+        <w:r>
+          <w:rPr>
+            <w:noProof/>
+            <w:webHidden/>
+          </w:rPr>
+          <w:fldChar w:fldCharType="separate"/>
+        </w:r>
+        <w:r>
+          <w:rPr>
+            <w:noProof/>
+            <w:webHidden/>
+          </w:rPr>
+          <w:t>35</w:t>
+        </w:r>
+        <w:r>
+          <w:rPr>
+            <w:noProof/>
+            <w:webHidden/>
+          </w:rPr>
+          <w:fldChar w:fldCharType="end"/>
+        </w:r>
+      </w:hyperlink>
+    </w:p>
+    <w:p>
+      <w:pPr>
+        <w:pStyle w:val="22"/>
+        <w:rPr>
+          <w:rFonts w:asciiTheme="minorHAnsi" w:eastAsiaTheme="minorEastAsia" w:hAnsiTheme="minorHAnsi"/>
+          <w:noProof/>
+          <w:color w:val="auto"/>
+          <w:sz w:val="22"/>
+          <w:lang w:val="en-US"/>
+        </w:rPr>
+      </w:pPr>
+      <w:hyperlink w:anchor="_Toc193875630" w:history="1">
+        <w:r>
+          <w:rPr>
+            <w:rStyle w:val="af4"/>
+            <w:noProof/>
+          </w:rPr>
+          <w:t>3.6 Результат проверки функции ЗП</w:t>
+        </w:r>
+        <w:r>
+          <w:rPr>
+            <w:noProof/>
+            <w:webHidden/>
+          </w:rPr>
+          <w:tab/>
+        </w:r>
+        <w:r>
+          <w:rPr>
+            <w:noProof/>
+            <w:webHidden/>
+          </w:rPr>
+          <w:fldChar w:fldCharType="begin"/>
+        </w:r>
+        <w:r>
+          <w:rPr>
+            <w:noProof/>
+            <w:webHidden/>
+          </w:rPr>
+          <w:instrText xml:space="preserve"> PAGEREF _Toc193875630 \h </w:instrText>
+        </w:r>
+        <w:r>
+          <w:rPr>
+            <w:noProof/>
+            <w:webHidden/>
+          </w:rPr>
+        </w:r>
+        <w:r>
+          <w:rPr>
+            <w:noProof/>
+            <w:webHidden/>
+          </w:rPr>
+          <w:fldChar w:fldCharType="separate"/>
+        </w:r>
+        <w:r>
+          <w:rPr>
+            <w:noProof/>
+            <w:webHidden/>
+          </w:rPr>
+          <w:t>36</w:t>
         </w:r>
         <w:r>
           <w:rPr>
@@ -1506,7 +2424,7 @@
         <w:lastRenderedPageBreak/>
         <w:tab/>
       </w:r>
-      <w:bookmarkStart w:id="0" w:name="_Toc193874820"/>
+      <w:bookmarkStart w:id="0" w:name="_Toc193875604"/>
       <w:r>
         <w:t>ОБЩИЕ СВЕДЕНИЯ</w:t>
       </w:r>
@@ -1516,7 +2434,7 @@
       <w:pPr>
         <w:pStyle w:val="2"/>
       </w:pPr>
-      <w:bookmarkStart w:id="1" w:name="_Toc193874821"/>
+      <w:bookmarkStart w:id="1" w:name="_Toc193875605"/>
       <w:r>
         <w:t>Цель проведения испытаний</w:t>
       </w:r>
@@ -1527,14 +2445,26 @@
         <w:pStyle w:val="a5"/>
       </w:pPr>
       <w:r>
-        <w:t>Проверка функциональной схемы устройства ЮНИТ-М300-Т2 в части функции МТЗ.</w:t>
+        <w:t>Проверка функциональн</w:t>
+      </w:r>
+      <w:r>
+        <w:t>ой схемы устройства ЮНИТ-М300-Т</w:t>
+      </w:r>
+      <w:r>
+        <w:t xml:space="preserve"> в части </w:t>
+      </w:r>
+      <w:r>
+        <w:t>токовых функций</w:t>
+      </w:r>
+      <w:r>
+        <w:t>.</w:t>
       </w:r>
     </w:p>
     <w:p>
       <w:pPr>
         <w:pStyle w:val="2"/>
       </w:pPr>
-      <w:bookmarkStart w:id="2" w:name="_Toc193874822"/>
+      <w:bookmarkStart w:id="2" w:name="_Toc193875606"/>
       <w:r>
         <w:t>Место</w:t>
       </w:r>
@@ -1681,7 +2611,7 @@
       <w:pPr>
         <w:pStyle w:val="2"/>
       </w:pPr>
-      <w:bookmarkStart w:id="3" w:name="_Toc193874823"/>
+      <w:bookmarkStart w:id="3" w:name="_Toc193875607"/>
       <w:r>
         <w:t>Информация об объекте испытаний</w:t>
       </w:r>
@@ -2025,7 +2955,7 @@
       <w:pPr>
         <w:pStyle w:val="2"/>
       </w:pPr>
-      <w:bookmarkStart w:id="4" w:name="_Toc193874824"/>
+      <w:bookmarkStart w:id="4" w:name="_Toc193875608"/>
       <w:r>
         <w:t>Период проведения испытаний</w:t>
       </w:r>
@@ -2052,7 +2982,7 @@
       <w:pPr>
         <w:pStyle w:val="2"/>
       </w:pPr>
-      <w:bookmarkStart w:id="5" w:name="_Toc193874825"/>
+      <w:bookmarkStart w:id="5" w:name="_Toc193875609"/>
       <w:r>
         <w:t>Условия проведения испытаний и измерений</w:t>
       </w:r>
@@ -2070,7 +3000,7 @@
       <w:pPr>
         <w:pStyle w:val="2"/>
       </w:pPr>
-      <w:bookmarkStart w:id="6" w:name="_Toc193874826"/>
+      <w:bookmarkStart w:id="6" w:name="_Toc193875610"/>
       <w:r>
         <w:t>Нормативная документация</w:t>
       </w:r>
@@ -2091,7 +3021,7 @@
       <w:pPr>
         <w:pStyle w:val="2"/>
       </w:pPr>
-      <w:bookmarkStart w:id="7" w:name="_Toc193874827"/>
+      <w:bookmarkStart w:id="7" w:name="_Toc193875611"/>
       <w:r>
         <w:lastRenderedPageBreak/>
         <w:t>Перечень используемых средств измерений (СИ), испытательного оборудования (ИО) и вспомогательного оборудования (ВО)</w:t>
@@ -3602,7 +4532,7 @@
       <w:pPr>
         <w:pStyle w:val="1"/>
       </w:pPr>
-      <w:bookmarkStart w:id="8" w:name="_Toc193874828"/>
+      <w:bookmarkStart w:id="8" w:name="_Toc193875612"/>
       <w:r>
         <w:lastRenderedPageBreak/>
         <w:t>ПРОГРАММА И МЕТОДИКИ ПРОВЕДЕНИЯ ИСПЫТАНИЙ</w:t>
@@ -3613,7 +4543,7 @@
       <w:pPr>
         <w:pStyle w:val="2"/>
       </w:pPr>
-      <w:bookmarkStart w:id="9" w:name="_Toc193874829"/>
+      <w:bookmarkStart w:id="9" w:name="_Toc193875613"/>
       <w:r>
         <w:t>Цел</w:t>
       </w:r>
@@ -3685,7 +4615,7 @@
           <w:color w:val="FF0000"/>
         </w:rPr>
       </w:pPr>
-      <w:bookmarkStart w:id="10" w:name="_Toc193874830"/>
+      <w:bookmarkStart w:id="10" w:name="_Toc193875614"/>
       <w:r>
         <w:rPr>
           <w:color w:val="FF0000"/>
@@ -3718,7 +4648,7 @@
       <w:pPr>
         <w:pStyle w:val="2"/>
       </w:pPr>
-      <w:bookmarkStart w:id="11" w:name="_Toc193874831"/>
+      <w:bookmarkStart w:id="11" w:name="_Toc193875615"/>
       <w:r>
         <w:t>Подключение дискретных входных и выходных цепей устройства</w:t>
       </w:r>
@@ -3726,7 +4656,7 @@
     </w:p>
     <w:p>
       <w:pPr>
-        <w:pStyle w:val="a5"/>
+        <w:pStyle w:val="3"/>
       </w:pPr>
       <w:r>
         <w:t>Подключение дискретных входных и выходных цепей производится в соответствии с рисунком 2.2.</w:t>
@@ -3763,7 +4693,7 @@
           <v:shape id="_x0000_i1025" type="#_x0000_t75" style="width:411.85pt;height:283.4pt" o:ole="">
             <v:imagedata r:id="rId10" o:title=""/>
           </v:shape>
-          <o:OLEObject Type="Embed" ProgID="Acrobat.Document.DC" ShapeID="_x0000_i1025" DrawAspect="Content" ObjectID="_1804488239" r:id="rId11"/>
+          <o:OLEObject Type="Embed" ProgID="Acrobat.Document.DC" ShapeID="_x0000_i1025" DrawAspect="Content" ObjectID="_1804922080" r:id="rId11"/>
         </w:object>
       </w:r>
     </w:p>
@@ -3779,7 +4709,7 @@
       <w:pPr>
         <w:pStyle w:val="2"/>
       </w:pPr>
-      <w:bookmarkStart w:id="12" w:name="_Toc193874832"/>
+      <w:bookmarkStart w:id="12" w:name="_Toc193875616"/>
       <w:r>
         <w:t>Назначение дискретных входов устройства ЮНИТ-М-300</w:t>
       </w:r>
@@ -3793,7 +4723,16 @@
         <w:t>Назначение дискретных входов на внутренние сигналы функциональной логики устройства ЮНИТ-М300 производится при помощи подключенного ПК с установленным ПО «ЮНИТ-СЕРВИС» в инструменте «Матрица входов и выходных реле».</w:t>
       </w:r>
       <w:r>
-        <w:t xml:space="preserve"> Назначение дискрентых входов должно соответствовать таблицам</w:t>
+        <w:t xml:space="preserve"> Назначение дискре</w:t>
+      </w:r>
+      <w:r>
+        <w:t>т</w:t>
+      </w:r>
+      <w:r>
+        <w:t>н</w:t>
+      </w:r>
+      <w:r>
+        <w:t>ых входов должно соответствовать таблицам</w:t>
       </w:r>
       <w:r>
         <w:t xml:space="preserve"> </w:t>
@@ -4057,20 +4996,92 @@
               <w:rPr>
                 <w:color w:val="00B0F0"/>
               </w:rPr>
-              <w:t>МТЗ 2 ст</w:t>
+              <w:t xml:space="preserve">ОВ </w:t>
             </w:r>
             <w:r>
               <w:rPr>
                 <w:color w:val="00B0F0"/>
-                <w:lang w:val="en-US"/>
-              </w:rPr>
-              <w:t xml:space="preserve">: </w:t>
-            </w:r>
-            <w:r>
+              </w:rPr>
+              <w:t>ЛЗТ</w:t>
+            </w:r>
+          </w:p>
+        </w:tc>
+      </w:tr>
+      <w:tr>
+        <w:tc>
+          <w:tcPr>
+            <w:tcW w:w="2482" w:type="dxa"/>
+          </w:tcPr>
+          <w:p>
+            <w:pPr>
+              <w:pStyle w:val="af0"/>
+            </w:pPr>
+            <w:r>
+              <w:t>М3.</w:t>
+            </w:r>
+            <w:r>
+              <w:rPr>
+                <w:lang w:val="en-US"/>
+              </w:rPr>
+              <w:t>XB:</w:t>
+            </w:r>
+            <w:r>
+              <w:t>3</w:t>
+            </w:r>
+          </w:p>
+        </w:tc>
+        <w:tc>
+          <w:tcPr>
+            <w:tcW w:w="2062" w:type="dxa"/>
+          </w:tcPr>
+          <w:p>
+            <w:pPr>
+              <w:pStyle w:val="af0"/>
+              <w:rPr>
+                <w:lang w:val="en-US"/>
+              </w:rPr>
+            </w:pPr>
+            <w:r>
+              <w:t>М3.</w:t>
+            </w:r>
+            <w:r>
+              <w:rPr>
+                <w:lang w:val="en-US"/>
+              </w:rPr>
+              <w:t>3</w:t>
+            </w:r>
+          </w:p>
+        </w:tc>
+        <w:tc>
+          <w:tcPr>
+            <w:tcW w:w="5061" w:type="dxa"/>
+          </w:tcPr>
+          <w:p>
+            <w:pPr>
+              <w:pStyle w:val="af0"/>
+              <w:jc w:val="left"/>
               <w:rPr>
                 <w:color w:val="00B0F0"/>
               </w:rPr>
-              <w:t>Пуск</w:t>
+            </w:pPr>
+            <w:r>
+              <w:rPr>
+                <w:color w:val="00B0F0"/>
+              </w:rPr>
+              <w:t>Внеш</w:t>
+            </w:r>
+            <w:r>
+              <w:rPr>
+                <w:color w:val="00B0F0"/>
+                <w:lang w:val="en-US"/>
+              </w:rPr>
+              <w:t xml:space="preserve">. </w:t>
+            </w:r>
+            <w:r>
+              <w:rPr>
+                <w:color w:val="00B0F0"/>
+              </w:rPr>
+              <w:t>пуск ЛЗТ</w:t>
             </w:r>
           </w:p>
         </w:tc>
@@ -4083,19 +5094,31 @@
           <w:p>
             <w:pPr>
               <w:pStyle w:val="af0"/>
-            </w:pPr>
-            <w:r>
-              <w:t>М3.</w:t>
-            </w:r>
-            <w:r>
-              <w:rPr>
-                <w:lang w:val="en-US"/>
-              </w:rPr>
-              <w:t>XB:</w:t>
-            </w:r>
-            <w:r>
+              <w:rPr>
+                <w:lang w:val="en-US"/>
+              </w:rPr>
+            </w:pPr>
+            <w:r>
+              <w:t>М</w:t>
+            </w:r>
+            <w:r>
+              <w:rPr>
+                <w:lang w:val="en-US"/>
+              </w:rPr>
               <w:t>3</w:t>
             </w:r>
+            <w:r>
+              <w:rPr>
+                <w:lang w:val="en-US"/>
+              </w:rPr>
+              <w:t>.XB:</w:t>
+            </w:r>
+            <w:r>
+              <w:rPr>
+                <w:lang w:val="en-US"/>
+              </w:rPr>
+              <w:t>4</w:t>
+            </w:r>
           </w:p>
         </w:tc>
         <w:tc>
@@ -4110,7 +5133,7 @@
               </w:rPr>
             </w:pPr>
             <w:r>
-              <w:t>М3.</w:t>
+              <w:t>М</w:t>
             </w:r>
             <w:r>
               <w:rPr>
@@ -4118,6 +5141,12 @@
               </w:rPr>
               <w:t>3</w:t>
             </w:r>
+            <w:r>
+              <w:rPr>
+                <w:lang w:val="en-US"/>
+              </w:rPr>
+              <w:t>.4</w:t>
+            </w:r>
           </w:p>
         </w:tc>
         <w:tc>
@@ -4136,20 +5165,7 @@
               <w:rPr>
                 <w:color w:val="00B0F0"/>
               </w:rPr>
-              <w:t>МТЗ 3 ст</w:t>
-            </w:r>
-            <w:r>
-              <w:rPr>
-                <w:color w:val="00B0F0"/>
-                <w:lang w:val="en-US"/>
-              </w:rPr>
-              <w:t xml:space="preserve">: </w:t>
-            </w:r>
-            <w:r>
-              <w:rPr>
-                <w:color w:val="00B0F0"/>
-              </w:rPr>
-              <w:t>Пуск</w:t>
+              <w:t>Блокировка ЛЗТ</w:t>
             </w:r>
           </w:p>
         </w:tc>
@@ -4185,7 +5201,7 @@
               <w:rPr>
                 <w:lang w:val="en-US"/>
               </w:rPr>
-              <w:t>4</w:t>
+              <w:t>5</w:t>
             </w:r>
           </w:p>
         </w:tc>
@@ -4213,7 +5229,7 @@
               <w:rPr>
                 <w:lang w:val="en-US"/>
               </w:rPr>
-              <w:t>.4</w:t>
+              <w:t>.5</w:t>
             </w:r>
           </w:p>
         </w:tc>
@@ -4225,21 +5241,9 @@
             <w:pPr>
               <w:pStyle w:val="af0"/>
               <w:jc w:val="left"/>
-              <w:rPr>
-                <w:color w:val="00B0F0"/>
-              </w:rPr>
-            </w:pPr>
-            <w:r>
-              <w:rPr>
-                <w:color w:val="00B0F0"/>
-              </w:rPr>
-              <w:t xml:space="preserve">ОВ </w:t>
-            </w:r>
-            <w:r>
-              <w:rPr>
-                <w:color w:val="00B0F0"/>
-              </w:rPr>
-              <w:t>ЛЗТ</w:t>
+            </w:pPr>
+            <w:r>
+              <w:t>Резерв</w:t>
             </w:r>
           </w:p>
         </w:tc>
@@ -4263,19 +5267,7 @@
               <w:rPr>
                 <w:lang w:val="en-US"/>
               </w:rPr>
-              <w:t>3</w:t>
-            </w:r>
-            <w:r>
-              <w:rPr>
-                <w:lang w:val="en-US"/>
-              </w:rPr>
-              <w:t>.XB:</w:t>
-            </w:r>
-            <w:r>
-              <w:rPr>
-                <w:lang w:val="en-US"/>
-              </w:rPr>
-              <w:t>5</w:t>
+              <w:t>3.XB:6</w:t>
             </w:r>
           </w:p>
         </w:tc>
@@ -4297,13 +5289,7 @@
               <w:rPr>
                 <w:lang w:val="en-US"/>
               </w:rPr>
-              <w:t>3</w:t>
-            </w:r>
-            <w:r>
-              <w:rPr>
-                <w:lang w:val="en-US"/>
-              </w:rPr>
-              <w:t>.5</w:t>
+              <w:t>3.6</w:t>
             </w:r>
           </w:p>
         </w:tc>
@@ -4315,94 +5301,9 @@
             <w:pPr>
               <w:pStyle w:val="af0"/>
               <w:jc w:val="left"/>
-              <w:rPr>
-                <w:color w:val="00B0F0"/>
-              </w:rPr>
-            </w:pPr>
-            <w:r>
-              <w:rPr>
-                <w:color w:val="00B0F0"/>
-              </w:rPr>
-              <w:t>Внеш</w:t>
-            </w:r>
-            <w:r>
-              <w:rPr>
-                <w:color w:val="00B0F0"/>
-                <w:lang w:val="en-US"/>
-              </w:rPr>
-              <w:t xml:space="preserve">. </w:t>
-            </w:r>
-            <w:r>
-              <w:rPr>
-                <w:color w:val="00B0F0"/>
-              </w:rPr>
-              <w:t>пуск ЛЗТ</w:t>
-            </w:r>
-          </w:p>
-        </w:tc>
-      </w:tr>
-      <w:tr>
-        <w:tc>
-          <w:tcPr>
-            <w:tcW w:w="2482" w:type="dxa"/>
-          </w:tcPr>
-          <w:p>
-            <w:pPr>
-              <w:pStyle w:val="af0"/>
-              <w:rPr>
-                <w:lang w:val="en-US"/>
-              </w:rPr>
-            </w:pPr>
-            <w:r>
-              <w:t>М</w:t>
-            </w:r>
-            <w:r>
-              <w:rPr>
-                <w:lang w:val="en-US"/>
-              </w:rPr>
-              <w:t>3.XB:6</w:t>
-            </w:r>
-          </w:p>
-        </w:tc>
-        <w:tc>
-          <w:tcPr>
-            <w:tcW w:w="2062" w:type="dxa"/>
-          </w:tcPr>
-          <w:p>
-            <w:pPr>
-              <w:pStyle w:val="af0"/>
-              <w:rPr>
-                <w:lang w:val="en-US"/>
-              </w:rPr>
-            </w:pPr>
-            <w:r>
-              <w:t>М</w:t>
-            </w:r>
-            <w:r>
-              <w:rPr>
-                <w:lang w:val="en-US"/>
-              </w:rPr>
-              <w:t>3.6</w:t>
-            </w:r>
-          </w:p>
-        </w:tc>
-        <w:tc>
-          <w:tcPr>
-            <w:tcW w:w="5061" w:type="dxa"/>
-          </w:tcPr>
-          <w:p>
-            <w:pPr>
-              <w:pStyle w:val="af0"/>
-              <w:jc w:val="left"/>
-              <w:rPr>
-                <w:color w:val="00B0F0"/>
-              </w:rPr>
-            </w:pPr>
-            <w:r>
-              <w:rPr>
-                <w:color w:val="00B0F0"/>
-              </w:rPr>
-              <w:t>Блокировка ЛЗТ</w:t>
+            </w:pPr>
+            <w:r>
+              <w:t>Резерв</w:t>
             </w:r>
           </w:p>
         </w:tc>
@@ -5135,23 +6036,7 @@
               <w:jc w:val="left"/>
             </w:pPr>
             <w:r>
-              <w:rPr>
-                <w:color w:val="00B0F0"/>
-              </w:rPr>
-              <w:t>МТЗ 1 ст</w:t>
-            </w:r>
-            <w:r>
-              <w:rPr>
-                <w:color w:val="00B0F0"/>
-                <w:lang w:val="en-US"/>
-              </w:rPr>
-              <w:t xml:space="preserve">: </w:t>
-            </w:r>
-            <w:r>
-              <w:rPr>
-                <w:color w:val="00B0F0"/>
-              </w:rPr>
-              <w:t>Пуск</w:t>
+              <w:t>Резерв</w:t>
             </w:r>
           </w:p>
         </w:tc>
@@ -5209,28 +6094,9 @@
             <w:pPr>
               <w:pStyle w:val="af0"/>
               <w:jc w:val="left"/>
-              <w:rPr>
-                <w:color w:val="00B0F0"/>
-              </w:rPr>
-            </w:pPr>
-            <w:r>
-              <w:rPr>
-                <w:color w:val="00B0F0"/>
-              </w:rPr>
-              <w:t>МТЗ 2 ст</w:t>
-            </w:r>
-            <w:r>
-              <w:rPr>
-                <w:color w:val="00B0F0"/>
-                <w:lang w:val="en-US"/>
-              </w:rPr>
-              <w:t xml:space="preserve">: </w:t>
-            </w:r>
-            <w:r>
-              <w:rPr>
-                <w:color w:val="00B0F0"/>
-              </w:rPr>
-              <w:t>Пуск</w:t>
+            </w:pPr>
+            <w:r>
+              <w:t>Резерв</w:t>
             </w:r>
           </w:p>
         </w:tc>
@@ -5288,28 +6154,9 @@
             <w:pPr>
               <w:pStyle w:val="af0"/>
               <w:jc w:val="left"/>
-              <w:rPr>
-                <w:color w:val="00B0F0"/>
-              </w:rPr>
-            </w:pPr>
-            <w:r>
-              <w:rPr>
-                <w:color w:val="00B0F0"/>
-              </w:rPr>
-              <w:t>МТЗ 3 ст</w:t>
-            </w:r>
-            <w:r>
-              <w:rPr>
-                <w:color w:val="00B0F0"/>
-                <w:lang w:val="en-US"/>
-              </w:rPr>
-              <w:t xml:space="preserve">: </w:t>
-            </w:r>
-            <w:r>
-              <w:rPr>
-                <w:color w:val="00B0F0"/>
-              </w:rPr>
-              <w:t>Пуск</w:t>
+            </w:pPr>
+            <w:r>
+              <w:t>Резерв</w:t>
             </w:r>
           </w:p>
         </w:tc>
@@ -9475,7 +10322,7 @@
       <w:pPr>
         <w:pStyle w:val="2"/>
       </w:pPr>
-      <w:bookmarkStart w:id="16" w:name="_Toc193874833"/>
+      <w:bookmarkStart w:id="16" w:name="_Toc193875617"/>
       <w:r>
         <w:lastRenderedPageBreak/>
         <w:t>Назначение выходных реле устройства ЮНИТ-М-300</w:t>
@@ -12006,8 +12853,6 @@
             <w:r>
               <w:t>Резерв</w:t>
             </w:r>
-            <w:bookmarkStart w:id="18" w:name="_GoBack"/>
-            <w:bookmarkEnd w:id="18"/>
           </w:p>
         </w:tc>
       </w:tr>
@@ -12214,14 +13059,14 @@
           <w:highlight w:val="green"/>
         </w:rPr>
       </w:pPr>
-      <w:bookmarkStart w:id="19" w:name="_Ref192835076"/>
+      <w:bookmarkStart w:id="18" w:name="_Ref192835076"/>
       <w:r>
         <w:rPr>
           <w:highlight w:val="green"/>
         </w:rPr>
         <w:t xml:space="preserve">Выходные реле устройства ЮНИТ-М300 для проверки </w:t>
       </w:r>
-      <w:bookmarkEnd w:id="19"/>
+      <w:bookmarkEnd w:id="18"/>
       <w:r>
         <w:rPr>
           <w:highlight w:val="green"/>
@@ -16179,14 +17024,14 @@
           <w:highlight w:val="cyan"/>
         </w:rPr>
       </w:pPr>
-      <w:bookmarkStart w:id="20" w:name="_Ref192835080"/>
+      <w:bookmarkStart w:id="19" w:name="_Ref192835080"/>
       <w:r>
         <w:rPr>
           <w:highlight w:val="cyan"/>
         </w:rPr>
         <w:t xml:space="preserve">Выходные реле устройства ЮНИТ-М300 для проверки </w:t>
       </w:r>
-      <w:bookmarkEnd w:id="20"/>
+      <w:bookmarkEnd w:id="19"/>
       <w:r>
         <w:rPr>
           <w:highlight w:val="cyan"/>
@@ -17474,6 +18319,13 @@
         </w:numPr>
         <w:ind w:left="709"/>
       </w:pPr>
+    </w:p>
+    <w:p>
+      <w:pPr>
+        <w:pStyle w:val="a5"/>
+      </w:pPr>
+      <w:bookmarkStart w:id="20" w:name="_GoBack"/>
+      <w:bookmarkEnd w:id="20"/>
     </w:p>
     <w:sectPr>
       <w:headerReference w:type="default" r:id="rId12"/>
@@ -17919,27 +18771,14 @@
           <w:r>
             <w:t>/</w:t>
           </w:r>
-          <w:r>
-            <w:fldChar w:fldCharType="begin"/>
-          </w:r>
-          <w:r>
-            <w:instrText xml:space="preserve"> NUMPAGES   \* MERGEFORMAT </w:instrText>
-          </w:r>
-          <w:r>
-            <w:fldChar w:fldCharType="separate"/>
-          </w:r>
-          <w:r>
-            <w:rPr>
-              <w:noProof/>
-            </w:rPr>
-            <w:t>10</w:t>
-          </w:r>
-          <w:r>
-            <w:rPr>
-              <w:noProof/>
-            </w:rPr>
-            <w:fldChar w:fldCharType="end"/>
-          </w:r>
+          <w:fldSimple w:instr=" NUMPAGES   \* MERGEFORMAT ">
+            <w:r>
+              <w:rPr>
+                <w:noProof/>
+              </w:rPr>
+              <w:t>10</w:t>
+            </w:r>
+          </w:fldSimple>
         </w:p>
       </w:tc>
     </w:tr>
@@ -18016,7 +18855,7 @@
             <w:rPr>
               <w:noProof/>
             </w:rPr>
-            <w:t>10</w:t>
+            <w:t>9</w:t>
           </w:r>
           <w:r>
             <w:fldChar w:fldCharType="end"/>
@@ -18024,14 +18863,27 @@
           <w:r>
             <w:t xml:space="preserve"> из </w:t>
           </w:r>
-          <w:fldSimple w:instr=" NUMPAGES ">
-            <w:r>
-              <w:rPr>
-                <w:noProof/>
-              </w:rPr>
-              <w:t>10</w:t>
-            </w:r>
-          </w:fldSimple>
+          <w:r>
+            <w:fldChar w:fldCharType="begin"/>
+          </w:r>
+          <w:r>
+            <w:instrText xml:space="preserve"> NUMPAGES </w:instrText>
+          </w:r>
+          <w:r>
+            <w:fldChar w:fldCharType="separate"/>
+          </w:r>
+          <w:r>
+            <w:rPr>
+              <w:noProof/>
+            </w:rPr>
+            <w:t>10</w:t>
+          </w:r>
+          <w:r>
+            <w:rPr>
+              <w:noProof/>
+            </w:rPr>
+            <w:fldChar w:fldCharType="end"/>
+          </w:r>
           <w:r>
             <w:t xml:space="preserve"> </w:t>
           </w:r>
@@ -20162,7 +21014,7 @@
 </file>
 
 <file path=customXml/itemProps1.xml><?xml version="1.0" encoding="utf-8"?>
-<ds:datastoreItem xmlns:ds="http://schemas.openxmlformats.org/officeDocument/2006/customXml" ds:itemID="{495451C4-1EFD-4EF6-8393-81DC6A89AD8F}">
+<ds:datastoreItem xmlns:ds="http://schemas.openxmlformats.org/officeDocument/2006/customXml" ds:itemID="{4436FF7B-8B0E-477F-983D-46D2253074D6}">
   <ds:schemaRefs>
     <ds:schemaRef ds:uri="http://schemas.openxmlformats.org/officeDocument/2006/bibliography"/>
   </ds:schemaRefs>

</xml_diff>